<commit_message>
update documentation and simulator
</commit_message>
<xml_diff>
--- a/dokumentasi_halaman_ipos5/00_INDEX_DOKUMENTASI_ALL_PAGES.docx
+++ b/dokumentasi_halaman_ipos5/00_INDEX_DOKUMENTASI_ALL_PAGES.docx
@@ -3,65 +3,112 @@
 <w:document xmlns:wpc="http://schemas.microsoft.com/office/word/2010/wordprocessingCanvas" xmlns:mo="http://schemas.microsoft.com/office/mac/office/2008/main" xmlns:mc="http://schemas.openxmlformats.org/markup-compatibility/2006" xmlns:mv="urn:schemas-microsoft-com:mac:vml" xmlns:o="urn:schemas-microsoft-com:office:office" xmlns:r="http://schemas.openxmlformats.org/officeDocument/2006/relationships" xmlns:m="http://schemas.openxmlformats.org/officeDocument/2006/math" xmlns:v="urn:schemas-microsoft-com:vml" xmlns:wp14="http://schemas.microsoft.com/office/word/2010/wordprocessingDrawing" xmlns:wp="http://schemas.openxmlformats.org/drawingml/2006/wordprocessingDrawing" xmlns:w10="urn:schemas-microsoft-com:office:word" xmlns:w="http://schemas.openxmlformats.org/wordprocessingml/2006/main" xmlns:w14="http://schemas.microsoft.com/office/word/2010/wordml" xmlns:wpg="http://schemas.microsoft.com/office/word/2010/wordprocessingGroup" xmlns:wpi="http://schemas.microsoft.com/office/word/2010/wordprocessingInk" xmlns:wne="http://schemas.microsoft.com/office/word/2006/wordml" xmlns:wps="http://schemas.microsoft.com/office/word/2010/wordprocessingShape" mc:Ignorable="w14 wp14">
   <w:body>
     <w:p>
-      <w:pPr>
-        <w:spacing w:after="80"/>
-      </w:pPr>
       <w:r>
         <w:rPr>
           <w:rFonts w:ascii="Arial" w:hAnsi="Arial"/>
           <w:b/>
-          <w:color w:val="0D1B38"/>
-          <w:sz w:val="36"/>
+          <w:color w:val="003366"/>
+          <w:sz w:val="30"/>
         </w:rPr>
-        <w:t>DOKUMENTASI TEKNIS HALAMAN</w:t>
-        <w:br/>
+        <w:t>DOKUMENTASI TEKNIS &amp; OPERASIONAL HALAMAN</w:t>
+      </w:r>
+    </w:p>
+    <w:p>
+      <w:r>
+        <w:rPr>
+          <w:b/>
+          <w:color w:val="CC3300"/>
+          <w:sz w:val="23"/>
+        </w:rPr>
         <w:t>MASTER INDEX DOKUMENTASI SELURUH HALAMAN IPOS5</w:t>
       </w:r>
     </w:p>
     <w:p>
       <w:pPr>
-        <w:spacing w:after="280"/>
+        <w:pStyle w:val="Heading2"/>
       </w:pPr>
       <w:r>
         <w:rPr>
-          <w:rFonts w:ascii="Arial" w:hAnsi="Arial"/>
           <w:b/>
-          <w:color w:val="E8431F"/>
-          <w:sz w:val="20"/>
+          <w:color w:val="003366"/>
+          <w:sz w:val="21"/>
         </w:rPr>
-        <w:t>IPOS5 Routing &amp; Schedule Management System — PT Pos Indonesia (Persero)</w:t>
+        <w:t>📌 METADATA &amp; INTEGRASI SISTEM</w:t>
       </w:r>
     </w:p>
     <w:tbl>
       <w:tblPr>
         <w:tblW w:type="auto" w:w="0"/>
         <w:jc w:val="center"/>
-        <w:tblLayout w:type="fixed"/>
         <w:tblLook w:firstColumn="1" w:firstRow="1" w:lastColumn="0" w:lastRow="0" w:noHBand="0" w:noVBand="1" w:val="04A0"/>
       </w:tblPr>
       <w:tblGrid>
-        <w:gridCol w:w="4824"/>
-        <w:gridCol w:w="4824"/>
+        <w:gridCol w:w="4968"/>
+        <w:gridCol w:w="4968"/>
       </w:tblGrid>
       <w:tr>
         <w:tc>
           <w:tcPr>
             <w:tcW w:type="dxa" w:w="3168"/>
-            <w:shd w:fill="0D1B38"/>
+            <w:shd w:fill="003366"/>
             <w:tcMar>
-              <w:top w:w="120" w:type="dxa"/>
-              <w:bottom w:w="120" w:type="dxa"/>
-              <w:left w:w="150" w:type="dxa"/>
-              <w:right w:w="150" w:type="dxa"/>
+              <w:top w:w="60" w:type="dxa"/>
+              <w:bottom w:w="60" w:type="dxa"/>
+              <w:left w:w="80" w:type="dxa"/>
+              <w:right w:w="80" w:type="dxa"/>
             </w:tcMar>
           </w:tcPr>
           <w:p>
             <w:r>
               <w:rPr>
-                <w:rFonts w:ascii="Arial" w:hAnsi="Arial"/>
                 <w:b/>
                 <w:color w:val="FFFFFF"/>
-                <w:sz w:val="19"/>
+                <w:sz w:val="18"/>
+              </w:rPr>
+              <w:t>Parameter</w:t>
+            </w:r>
+          </w:p>
+        </w:tc>
+        <w:tc>
+          <w:tcPr>
+            <w:tcW w:type="dxa" w:w="6624"/>
+            <w:shd w:fill="003366"/>
+            <w:tcMar>
+              <w:top w:w="60" w:type="dxa"/>
+              <w:bottom w:w="60" w:type="dxa"/>
+              <w:left w:w="80" w:type="dxa"/>
+              <w:right w:w="80" w:type="dxa"/>
+            </w:tcMar>
+          </w:tcPr>
+          <w:p>
+            <w:r>
+              <w:rPr>
+                <w:b/>
+                <w:color w:val="FFFFFF"/>
+                <w:sz w:val="18"/>
+              </w:rPr>
+              <w:t>Nilai / Spesifikasi Sistem</w:t>
+            </w:r>
+          </w:p>
+        </w:tc>
+      </w:tr>
+      <w:tr>
+        <w:tc>
+          <w:tcPr>
+            <w:tcW w:type="dxa" w:w="3168"/>
+            <w:shd w:fill="FFFFFF"/>
+            <w:tcMar>
+              <w:top w:w="60" w:type="dxa"/>
+              <w:bottom w:w="60" w:type="dxa"/>
+              <w:left w:w="80" w:type="dxa"/>
+              <w:right w:w="80" w:type="dxa"/>
+            </w:tcMar>
+          </w:tcPr>
+          <w:p>
+            <w:r>
+              <w:rPr>
+                <w:b/>
+                <w:sz w:val="17"/>
               </w:rPr>
               <w:t>Aplikasi Induk</w:t>
             </w:r>
@@ -69,21 +116,19 @@
         </w:tc>
         <w:tc>
           <w:tcPr>
-            <w:tcW w:type="dxa" w:w="6480"/>
-            <w:shd w:fill="F8FAFC"/>
+            <w:tcW w:type="dxa" w:w="6624"/>
+            <w:shd w:fill="FFFFFF"/>
             <w:tcMar>
-              <w:top w:w="120" w:type="dxa"/>
-              <w:bottom w:w="120" w:type="dxa"/>
-              <w:left w:w="150" w:type="dxa"/>
-              <w:right w:w="150" w:type="dxa"/>
+              <w:top w:w="60" w:type="dxa"/>
+              <w:bottom w:w="60" w:type="dxa"/>
+              <w:left w:w="80" w:type="dxa"/>
+              <w:right w:w="80" w:type="dxa"/>
             </w:tcMar>
           </w:tcPr>
           <w:p>
             <w:r>
               <w:rPr>
-                <w:rFonts w:ascii="Arial" w:hAnsi="Arial"/>
-                <w:color w:val="0F172A"/>
-                <w:sz w:val="19"/>
+                <w:sz w:val="17"/>
               </w:rPr>
               <w:t>IPOS5 Routing &amp; Schedule Management System</w:t>
             </w:r>
@@ -94,21 +139,19 @@
         <w:tc>
           <w:tcPr>
             <w:tcW w:type="dxa" w:w="3168"/>
-            <w:shd w:fill="0D1B38"/>
+            <w:shd w:fill="F9FAFB"/>
             <w:tcMar>
-              <w:top w:w="120" w:type="dxa"/>
-              <w:bottom w:w="120" w:type="dxa"/>
-              <w:left w:w="150" w:type="dxa"/>
-              <w:right w:w="150" w:type="dxa"/>
+              <w:top w:w="60" w:type="dxa"/>
+              <w:bottom w:w="60" w:type="dxa"/>
+              <w:left w:w="80" w:type="dxa"/>
+              <w:right w:w="80" w:type="dxa"/>
             </w:tcMar>
           </w:tcPr>
           <w:p>
             <w:r>
               <w:rPr>
-                <w:rFonts w:ascii="Arial" w:hAnsi="Arial"/>
                 <w:b/>
-                <w:color w:val="FFFFFF"/>
-                <w:sz w:val="19"/>
+                <w:sz w:val="17"/>
               </w:rPr>
               <w:t>Organisasi</w:t>
             </w:r>
@@ -116,21 +159,19 @@
         </w:tc>
         <w:tc>
           <w:tcPr>
-            <w:tcW w:type="dxa" w:w="6480"/>
-            <w:shd w:fill="F8FAFC"/>
+            <w:tcW w:type="dxa" w:w="6624"/>
+            <w:shd w:fill="F9FAFB"/>
             <w:tcMar>
-              <w:top w:w="120" w:type="dxa"/>
-              <w:bottom w:w="120" w:type="dxa"/>
-              <w:left w:w="150" w:type="dxa"/>
-              <w:right w:w="150" w:type="dxa"/>
+              <w:top w:w="60" w:type="dxa"/>
+              <w:bottom w:w="60" w:type="dxa"/>
+              <w:left w:w="80" w:type="dxa"/>
+              <w:right w:w="80" w:type="dxa"/>
             </w:tcMar>
           </w:tcPr>
           <w:p>
             <w:r>
               <w:rPr>
-                <w:rFonts w:ascii="Arial" w:hAnsi="Arial"/>
-                <w:color w:val="0F172A"/>
-                <w:sz w:val="19"/>
+                <w:sz w:val="17"/>
               </w:rPr>
               <w:t>PT Pos Indonesia (Persero)</w:t>
             </w:r>
@@ -141,21 +182,19 @@
         <w:tc>
           <w:tcPr>
             <w:tcW w:type="dxa" w:w="3168"/>
-            <w:shd w:fill="0D1B38"/>
+            <w:shd w:fill="FFFFFF"/>
             <w:tcMar>
-              <w:top w:w="120" w:type="dxa"/>
-              <w:bottom w:w="120" w:type="dxa"/>
-              <w:left w:w="150" w:type="dxa"/>
-              <w:right w:w="150" w:type="dxa"/>
+              <w:top w:w="60" w:type="dxa"/>
+              <w:bottom w:w="60" w:type="dxa"/>
+              <w:left w:w="80" w:type="dxa"/>
+              <w:right w:w="80" w:type="dxa"/>
             </w:tcMar>
           </w:tcPr>
           <w:p>
             <w:r>
               <w:rPr>
-                <w:rFonts w:ascii="Arial" w:hAnsi="Arial"/>
                 <w:b/>
-                <w:color w:val="FFFFFF"/>
-                <w:sz w:val="19"/>
+                <w:sz w:val="17"/>
               </w:rPr>
               <w:t>Total Modul / Halaman</w:t>
             </w:r>
@@ -163,23 +202,21 @@
         </w:tc>
         <w:tc>
           <w:tcPr>
-            <w:tcW w:type="dxa" w:w="6480"/>
-            <w:shd w:fill="F8FAFC"/>
+            <w:tcW w:type="dxa" w:w="6624"/>
+            <w:shd w:fill="FFFFFF"/>
             <w:tcMar>
-              <w:top w:w="120" w:type="dxa"/>
-              <w:bottom w:w="120" w:type="dxa"/>
-              <w:left w:w="150" w:type="dxa"/>
-              <w:right w:w="150" w:type="dxa"/>
+              <w:top w:w="60" w:type="dxa"/>
+              <w:bottom w:w="60" w:type="dxa"/>
+              <w:left w:w="80" w:type="dxa"/>
+              <w:right w:w="80" w:type="dxa"/>
             </w:tcMar>
           </w:tcPr>
           <w:p>
             <w:r>
               <w:rPr>
-                <w:rFonts w:ascii="Arial" w:hAnsi="Arial"/>
-                <w:color w:val="0F172A"/>
-                <w:sz w:val="19"/>
+                <w:sz w:val="17"/>
               </w:rPr>
-              <w:t>15 Modul Utama (16 File Dokumentasi)</w:t>
+              <w:t>15 Modul Utama (16 File Dokumentasi Terstruktur)</w:t>
             </w:r>
           </w:p>
         </w:tc>
@@ -188,45 +225,41 @@
         <w:tc>
           <w:tcPr>
             <w:tcW w:type="dxa" w:w="3168"/>
-            <w:shd w:fill="0D1B38"/>
+            <w:shd w:fill="F9FAFB"/>
             <w:tcMar>
-              <w:top w:w="120" w:type="dxa"/>
-              <w:bottom w:w="120" w:type="dxa"/>
-              <w:left w:w="150" w:type="dxa"/>
-              <w:right w:w="150" w:type="dxa"/>
+              <w:top w:w="60" w:type="dxa"/>
+              <w:bottom w:w="60" w:type="dxa"/>
+              <w:left w:w="80" w:type="dxa"/>
+              <w:right w:w="80" w:type="dxa"/>
             </w:tcMar>
           </w:tcPr>
           <w:p>
             <w:r>
               <w:rPr>
-                <w:rFonts w:ascii="Arial" w:hAnsi="Arial"/>
                 <w:b/>
-                <w:color w:val="FFFFFF"/>
-                <w:sz w:val="19"/>
+                <w:sz w:val="17"/>
               </w:rPr>
-              <w:t>Arsitektur</w:t>
+              <w:t>Arsitektur Sistem</w:t>
             </w:r>
           </w:p>
         </w:tc>
         <w:tc>
           <w:tcPr>
-            <w:tcW w:type="dxa" w:w="6480"/>
-            <w:shd w:fill="F8FAFC"/>
+            <w:tcW w:type="dxa" w:w="6624"/>
+            <w:shd w:fill="F9FAFB"/>
             <w:tcMar>
-              <w:top w:w="120" w:type="dxa"/>
-              <w:bottom w:w="120" w:type="dxa"/>
-              <w:left w:w="150" w:type="dxa"/>
-              <w:right w:w="150" w:type="dxa"/>
+              <w:top w:w="60" w:type="dxa"/>
+              <w:bottom w:w="60" w:type="dxa"/>
+              <w:left w:w="80" w:type="dxa"/>
+              <w:right w:w="80" w:type="dxa"/>
             </w:tcMar>
           </w:tcPr>
           <w:p>
             <w:r>
               <w:rPr>
-                <w:rFonts w:ascii="Arial" w:hAnsi="Arial"/>
-                <w:color w:val="0F172A"/>
-                <w:sz w:val="19"/>
+                <w:sz w:val="17"/>
               </w:rPr>
-              <w:t>React Vite + Express.js OOP MVC + MongoDB Multi-Server</w:t>
+              <w:t>React 18 Vite + Express.js OOP MVC + MongoDB Multi-Server</w:t>
             </w:r>
           </w:p>
         </w:tc>
@@ -235,21 +268,19 @@
         <w:tc>
           <w:tcPr>
             <w:tcW w:type="dxa" w:w="3168"/>
-            <w:shd w:fill="0D1B38"/>
+            <w:shd w:fill="FFFFFF"/>
             <w:tcMar>
-              <w:top w:w="120" w:type="dxa"/>
-              <w:bottom w:w="120" w:type="dxa"/>
-              <w:left w:w="150" w:type="dxa"/>
-              <w:right w:w="150" w:type="dxa"/>
+              <w:top w:w="60" w:type="dxa"/>
+              <w:bottom w:w="60" w:type="dxa"/>
+              <w:left w:w="80" w:type="dxa"/>
+              <w:right w:w="80" w:type="dxa"/>
             </w:tcMar>
           </w:tcPr>
           <w:p>
             <w:r>
               <w:rPr>
-                <w:rFonts w:ascii="Arial" w:hAnsi="Arial"/>
                 <w:b/>
-                <w:color w:val="FFFFFF"/>
-                <w:sz w:val="19"/>
+                <w:sz w:val="17"/>
               </w:rPr>
               <w:t>Versi Sistem</w:t>
             </w:r>
@@ -257,445 +288,1866 @@
         </w:tc>
         <w:tc>
           <w:tcPr>
-            <w:tcW w:type="dxa" w:w="6480"/>
-            <w:shd w:fill="F8FAFC"/>
+            <w:tcW w:type="dxa" w:w="6624"/>
+            <w:shd w:fill="FFFFFF"/>
             <w:tcMar>
-              <w:top w:w="120" w:type="dxa"/>
-              <w:bottom w:w="120" w:type="dxa"/>
-              <w:left w:w="150" w:type="dxa"/>
-              <w:right w:w="150" w:type="dxa"/>
+              <w:top w:w="60" w:type="dxa"/>
+              <w:bottom w:w="60" w:type="dxa"/>
+              <w:left w:w="80" w:type="dxa"/>
+              <w:right w:w="80" w:type="dxa"/>
             </w:tcMar>
           </w:tcPr>
           <w:p>
             <w:r>
               <w:rPr>
-                <w:rFonts w:ascii="Arial" w:hAnsi="Arial"/>
-                <w:color w:val="0F172A"/>
-                <w:sz w:val="19"/>
+                <w:sz w:val="17"/>
               </w:rPr>
               <w:t>Redesign Enterprise v2.5.0</w:t>
             </w:r>
           </w:p>
         </w:tc>
       </w:tr>
+      <w:tr>
+        <w:tc>
+          <w:tcPr>
+            <w:tcW w:type="dxa" w:w="3168"/>
+            <w:shd w:fill="F9FAFB"/>
+            <w:tcMar>
+              <w:top w:w="60" w:type="dxa"/>
+              <w:bottom w:w="60" w:type="dxa"/>
+              <w:left w:w="80" w:type="dxa"/>
+              <w:right w:w="80" w:type="dxa"/>
+            </w:tcMar>
+          </w:tcPr>
+          <w:p>
+            <w:r>
+              <w:rPr>
+                <w:b/>
+                <w:sz w:val="17"/>
+              </w:rPr>
+              <w:t>Karakteristik Dokumentasi</w:t>
+            </w:r>
+          </w:p>
+        </w:tc>
+        <w:tc>
+          <w:tcPr>
+            <w:tcW w:type="dxa" w:w="6624"/>
+            <w:shd w:fill="F9FAFB"/>
+            <w:tcMar>
+              <w:top w:w="60" w:type="dxa"/>
+              <w:bottom w:w="60" w:type="dxa"/>
+              <w:left w:w="80" w:type="dxa"/>
+              <w:right w:w="80" w:type="dxa"/>
+            </w:tcMar>
+          </w:tcPr>
+          <w:p>
+            <w:r>
+              <w:rPr>
+                <w:sz w:val="17"/>
+              </w:rPr>
+              <w:t>Dilengkapi Wireframe ASCII Tata Letak UI &amp; Rincian Kotak/Komponen</w:t>
+            </w:r>
+          </w:p>
+        </w:tc>
+      </w:tr>
     </w:tbl>
+    <w:p/>
     <w:p>
       <w:pPr>
-        <w:spacing w:after="200"/>
-      </w:pPr>
-    </w:p>
-    <w:p>
-      <w:pPr>
-        <w:spacing w:before="280" w:after="120"/>
+        <w:pStyle w:val="Heading2"/>
       </w:pPr>
       <w:r>
         <w:rPr>
-          <w:rFonts w:ascii="Arial" w:hAnsi="Arial"/>
           <w:b/>
-          <w:color w:val="0284C7"/>
-          <w:sz w:val="26"/>
+          <w:color w:val="003366"/>
+          <w:sz w:val="23"/>
         </w:rPr>
-        <w:t>1. Pendahuluan &amp; Struktur Dokumentasi</w:t>
+        <w:t>1. Pendahuluan &amp; Gambaran Umum Sistem</w:t>
+      </w:r>
+    </w:p>
+    <w:p>
+      <w:r>
+        <w:rPr>
+          <w:sz w:val="19"/>
+        </w:rPr>
+        <w:t>Dokumentasi ini menyajikan spesifikasi teknis, operasional, dan arsitektur visual tata letak antarmuka untuk seluruh 15 modul halaman pada sistem IPOS5 (Integrated Post Office System v5) PT Pos Indonesia. Setiap modul didokumentasikan dalam format Markdown (.md) dan Microsoft Word (.docx) secara mandiri, disertai diagram wireframe tata letak layar (layout grid) serta rincian fungsi setiap komponen/kotak visual.</w:t>
       </w:r>
     </w:p>
     <w:p>
       <w:pPr>
-        <w:spacing w:after="80" w:line="276" w:lineRule="auto"/>
+        <w:pStyle w:val="Heading2"/>
       </w:pPr>
       <w:r>
         <w:rPr>
-          <w:rFonts w:ascii="Arial" w:hAnsi="Arial"/>
-          <w:color w:val="334155"/>
+          <w:b/>
+          <w:color w:val="003366"/>
+          <w:sz w:val="23"/>
+        </w:rPr>
+        <w:t>2. Struktur Peta Navigasi &amp; Hirarki Modul Halaman</w:t>
+      </w:r>
+    </w:p>
+    <w:p>
+      <w:r>
+        <w:rPr>
+          <w:b/>
+          <w:color w:val="004488"/>
           <w:sz w:val="19"/>
         </w:rPr>
-        <w:t>Dokumentasi ini mencakup penjelasan teknis dan operasional secara detail untuk seluruh 15 modul halaman pada aplikasi IPOS5 PT Pos Indonesia. Setiap halaman didokumentasikan dalam 2 format file independen: format Markdown (.md) dan Microsoft Word (.docx).</w:t>
+        <w:t>📐 Diagram Visual Tata Letak Halaman (Wireframe UI Layout):</w:t>
       </w:r>
     </w:p>
     <w:p>
       <w:pPr>
-        <w:spacing w:after="80" w:line="276" w:lineRule="auto"/>
+        <w:spacing w:before="40" w:after="80"/>
+        <w:ind w:left="144"/>
       </w:pPr>
       <w:r>
         <w:rPr>
-          <w:rFonts w:ascii="Arial" w:hAnsi="Arial"/>
-          <w:color w:val="334155"/>
-          <w:sz w:val="19"/>
+          <w:rFonts w:ascii="Consolas" w:hAnsi="Consolas"/>
+          <w:sz w:val="16"/>
         </w:rPr>
-        <w:t>Sistem IPOS5 dirancang untuk mengelola pendistribusian kiriman pos, manajemen armada kendaraan feeder/intercity, penjadwalan rantai pasok logistik, telemetri Milk Run multi-stop, dan pemantauan gate transit gerbang gerak secara real-time.</w:t>
+        <w:t>+---------------------------------------------------------------------------------------------------------+</w:t>
+        <w:br/>
+        <w:t>|                                  IPOS5 ENTERPRISE SYSTEM ARCHITECTURE                                   |</w:t>
+        <w:br/>
+        <w:t>+---------------------------------------------------------------------------------------------------------+</w:t>
+        <w:br/>
+        <w:t>| [OPERATIONS]           | [MASTER DATA]          | [LOGISTICS &amp; PLANNING] | [ANALYTICS &amp; SYSTEM]         |</w:t>
+        <w:br/>
+        <w:t>| • 01. Dashboard (/)    | • 03. Kantor (/kantor) | • 07. Template (/tmpl) | • 12. Analitik (/analytics)  |</w:t>
+        <w:br/>
+        <w:t>| • 02. Checker (/check) | • 04. Produk (/produk) | • 08. Jadwal (/jadwal) | • 13. Transaksi (/transaksi) |</w:t>
+        <w:br/>
+        <w:t>|                        | • 05. Fleet (/kendaraan| • 09. Milk Run (/jrn)  | • 14. Settings (/settings)   |</w:t>
+        <w:br/>
+        <w:t>|                        | • 06. Route (/route)   | • 10. Estimasi (/est)  | • 15. Profile (/profile)     |</w:t>
+        <w:br/>
+        <w:t>|                        |                        | • 11. Gate (/transit)  |                              |</w:t>
+        <w:br/>
+        <w:t>+---------------------------------------------------------------------------------------------------------+</w:t>
       </w:r>
     </w:p>
     <w:p>
-      <w:pPr>
-        <w:spacing w:before="280" w:after="120"/>
-      </w:pPr>
       <w:r>
         <w:rPr>
-          <w:rFonts w:ascii="Arial" w:hAnsi="Arial"/>
           <w:b/>
-          <w:color w:val="0284C7"/>
-          <w:sz w:val="26"/>
+          <w:color w:val="CC3300"/>
+          <w:sz w:val="20"/>
         </w:rPr>
-        <w:t>2. Daftar Pemetaan Modul Halaman &amp; Route URL</w:t>
+        <w:t>📋 Rincian &amp; Keterangan Setiap Kotak / Komponen Tata Letak:</w:t>
       </w:r>
     </w:p>
+    <w:tbl>
+      <w:tblPr>
+        <w:tblW w:type="auto" w:w="0"/>
+        <w:jc w:val="center"/>
+        <w:tblLook w:firstColumn="1" w:firstRow="1" w:lastColumn="0" w:lastRow="0" w:noHBand="0" w:noVBand="1" w:val="04A0"/>
+      </w:tblPr>
+      <w:tblGrid>
+        <w:gridCol w:w="1987"/>
+        <w:gridCol w:w="1987"/>
+        <w:gridCol w:w="1987"/>
+        <w:gridCol w:w="1987"/>
+        <w:gridCol w:w="1987"/>
+      </w:tblGrid>
+      <w:tr>
+        <w:tc>
+          <w:tcPr>
+            <w:tcW w:type="dxa" w:w="2016"/>
+            <w:shd w:fill="003366"/>
+            <w:tcMar>
+              <w:top w:w="60" w:type="dxa"/>
+              <w:bottom w:w="60" w:type="dxa"/>
+              <w:left w:w="80" w:type="dxa"/>
+              <w:right w:w="80" w:type="dxa"/>
+            </w:tcMar>
+          </w:tcPr>
+          <w:p>
+            <w:r>
+              <w:rPr>
+                <w:b/>
+                <w:color w:val="FFFFFF"/>
+                <w:sz w:val="16"/>
+              </w:rPr>
+              <w:t>Bagian / Kotak UI</w:t>
+            </w:r>
+          </w:p>
+        </w:tc>
+        <w:tc>
+          <w:tcPr>
+            <w:tcW w:type="dxa" w:w="1728"/>
+            <w:shd w:fill="003366"/>
+            <w:tcMar>
+              <w:top w:w="60" w:type="dxa"/>
+              <w:bottom w:w="60" w:type="dxa"/>
+              <w:left w:w="80" w:type="dxa"/>
+              <w:right w:w="80" w:type="dxa"/>
+            </w:tcMar>
+          </w:tcPr>
+          <w:p>
+            <w:r>
+              <w:rPr>
+                <w:b/>
+                <w:color w:val="FFFFFF"/>
+                <w:sz w:val="16"/>
+              </w:rPr>
+              <w:t>Tipe Visual &amp; Posisi</w:t>
+            </w:r>
+          </w:p>
+        </w:tc>
+        <w:tc>
+          <w:tcPr>
+            <w:tcW w:type="dxa" w:w="2304"/>
+            <w:shd w:fill="003366"/>
+            <w:tcMar>
+              <w:top w:w="60" w:type="dxa"/>
+              <w:bottom w:w="60" w:type="dxa"/>
+              <w:left w:w="80" w:type="dxa"/>
+              <w:right w:w="80" w:type="dxa"/>
+            </w:tcMar>
+          </w:tcPr>
+          <w:p>
+            <w:r>
+              <w:rPr>
+                <w:b/>
+                <w:color w:val="FFFFFF"/>
+                <w:sz w:val="16"/>
+              </w:rPr>
+              <w:t>Fungsi &amp; Kegunaan</w:t>
+            </w:r>
+          </w:p>
+        </w:tc>
+        <w:tc>
+          <w:tcPr>
+            <w:tcW w:type="dxa" w:w="2016"/>
+            <w:shd w:fill="003366"/>
+            <w:tcMar>
+              <w:top w:w="60" w:type="dxa"/>
+              <w:bottom w:w="60" w:type="dxa"/>
+              <w:left w:w="80" w:type="dxa"/>
+              <w:right w:w="80" w:type="dxa"/>
+            </w:tcMar>
+          </w:tcPr>
+          <w:p>
+            <w:r>
+              <w:rPr>
+                <w:b/>
+                <w:color w:val="FFFFFF"/>
+                <w:sz w:val="16"/>
+              </w:rPr>
+              <w:t>Sumber Data &amp; Kalkulasi</w:t>
+            </w:r>
+          </w:p>
+        </w:tc>
+        <w:tc>
+          <w:tcPr>
+            <w:tcW w:type="dxa" w:w="1728"/>
+            <w:shd w:fill="003366"/>
+            <w:tcMar>
+              <w:top w:w="60" w:type="dxa"/>
+              <w:bottom w:w="60" w:type="dxa"/>
+              <w:left w:w="80" w:type="dxa"/>
+              <w:right w:w="80" w:type="dxa"/>
+            </w:tcMar>
+          </w:tcPr>
+          <w:p>
+            <w:r>
+              <w:rPr>
+                <w:b/>
+                <w:color w:val="FFFFFF"/>
+                <w:sz w:val="16"/>
+              </w:rPr>
+              <w:t>Interaktivitas &amp; Aksi</w:t>
+            </w:r>
+          </w:p>
+        </w:tc>
+      </w:tr>
+      <w:tr>
+        <w:tc>
+          <w:tcPr>
+            <w:tcW w:type="dxa" w:w="2016"/>
+            <w:shd w:fill="FFFFFF"/>
+            <w:tcMar>
+              <w:top w:w="60" w:type="dxa"/>
+              <w:bottom w:w="60" w:type="dxa"/>
+              <w:left w:w="80" w:type="dxa"/>
+              <w:right w:w="80" w:type="dxa"/>
+            </w:tcMar>
+          </w:tcPr>
+          <w:p>
+            <w:r>
+              <w:rPr>
+                <w:b/>
+                <w:color w:val="003366"/>
+                <w:sz w:val="15"/>
+              </w:rPr>
+              <w:t>Modul 01 — Dashboard Operasional</w:t>
+            </w:r>
+          </w:p>
+        </w:tc>
+        <w:tc>
+          <w:tcPr>
+            <w:tcW w:type="dxa" w:w="1728"/>
+            <w:shd w:fill="FFFFFF"/>
+            <w:tcMar>
+              <w:top w:w="60" w:type="dxa"/>
+              <w:bottom w:w="60" w:type="dxa"/>
+              <w:left w:w="80" w:type="dxa"/>
+              <w:right w:w="80" w:type="dxa"/>
+            </w:tcMar>
+          </w:tcPr>
+          <w:p>
+            <w:r>
+              <w:rPr>
+                <w:sz w:val="15"/>
+              </w:rPr>
+              <w:t>Halaman Utama (`/`)</w:t>
+            </w:r>
+          </w:p>
+        </w:tc>
+        <w:tc>
+          <w:tcPr>
+            <w:tcW w:type="dxa" w:w="2304"/>
+            <w:shd w:fill="FFFFFF"/>
+            <w:tcMar>
+              <w:top w:w="60" w:type="dxa"/>
+              <w:bottom w:w="60" w:type="dxa"/>
+              <w:left w:w="80" w:type="dxa"/>
+              <w:right w:w="80" w:type="dxa"/>
+            </w:tcMar>
+          </w:tcPr>
+          <w:p>
+            <w:r>
+              <w:rPr>
+                <w:sz w:val="15"/>
+              </w:rPr>
+              <w:t>Pusat komando metrik volume paket, tonase muatan, status pengiriman, grafik tren, dan live stream connotes.</w:t>
+            </w:r>
+          </w:p>
+        </w:tc>
+        <w:tc>
+          <w:tcPr>
+            <w:tcW w:type="dxa" w:w="2016"/>
+            <w:shd w:fill="FFFFFF"/>
+            <w:tcMar>
+              <w:top w:w="60" w:type="dxa"/>
+              <w:bottom w:w="60" w:type="dxa"/>
+              <w:left w:w="80" w:type="dxa"/>
+              <w:right w:w="80" w:type="dxa"/>
+            </w:tcMar>
+          </w:tcPr>
+          <w:p>
+            <w:r>
+              <w:rPr>
+                <w:sz w:val="15"/>
+              </w:rPr>
+              <w:t>transaksi, master_kendaraan, route_journeys</w:t>
+            </w:r>
+          </w:p>
+        </w:tc>
+        <w:tc>
+          <w:tcPr>
+            <w:tcW w:type="dxa" w:w="1728"/>
+            <w:shd w:fill="FFFFFF"/>
+            <w:tcMar>
+              <w:top w:w="60" w:type="dxa"/>
+              <w:bottom w:w="60" w:type="dxa"/>
+              <w:left w:w="80" w:type="dxa"/>
+              <w:right w:w="80" w:type="dxa"/>
+            </w:tcMar>
+          </w:tcPr>
+          <w:p>
+            <w:r>
+              <w:rPr>
+                <w:sz w:val="15"/>
+              </w:rPr>
+              <w:t>Filter periode data (Hari Ini, 7D, 30D, YTD, Custom Range), hover tooltip, live polling 5s.</w:t>
+            </w:r>
+          </w:p>
+        </w:tc>
+      </w:tr>
+      <w:tr>
+        <w:tc>
+          <w:tcPr>
+            <w:tcW w:type="dxa" w:w="2016"/>
+            <w:shd w:fill="F9FAFB"/>
+            <w:tcMar>
+              <w:top w:w="60" w:type="dxa"/>
+              <w:bottom w:w="60" w:type="dxa"/>
+              <w:left w:w="80" w:type="dxa"/>
+              <w:right w:w="80" w:type="dxa"/>
+            </w:tcMar>
+          </w:tcPr>
+          <w:p>
+            <w:r>
+              <w:rPr>
+                <w:b/>
+                <w:color w:val="003366"/>
+                <w:sz w:val="15"/>
+              </w:rPr>
+              <w:t>Modul 02 — Package Tracking &amp; Checker</w:t>
+            </w:r>
+          </w:p>
+        </w:tc>
+        <w:tc>
+          <w:tcPr>
+            <w:tcW w:type="dxa" w:w="1728"/>
+            <w:shd w:fill="F9FAFB"/>
+            <w:tcMar>
+              <w:top w:w="60" w:type="dxa"/>
+              <w:bottom w:w="60" w:type="dxa"/>
+              <w:left w:w="80" w:type="dxa"/>
+              <w:right w:w="80" w:type="dxa"/>
+            </w:tcMar>
+          </w:tcPr>
+          <w:p>
+            <w:r>
+              <w:rPr>
+                <w:sz w:val="15"/>
+              </w:rPr>
+              <w:t>Operasional (`/checker`)</w:t>
+            </w:r>
+          </w:p>
+        </w:tc>
+        <w:tc>
+          <w:tcPr>
+            <w:tcW w:type="dxa" w:w="2304"/>
+            <w:shd w:fill="F9FAFB"/>
+            <w:tcMar>
+              <w:top w:w="60" w:type="dxa"/>
+              <w:bottom w:w="60" w:type="dxa"/>
+              <w:left w:w="80" w:type="dxa"/>
+              <w:right w:w="80" w:type="dxa"/>
+            </w:tcMar>
+          </w:tcPr>
+          <w:p>
+            <w:r>
+              <w:rPr>
+                <w:sz w:val="15"/>
+              </w:rPr>
+              <w:t>Pelacakan resi connote (14-15 digit) atau armada mobil dengan multi-stop waypoint stepper, gauge muatan, dan log audit.</w:t>
+            </w:r>
+          </w:p>
+        </w:tc>
+        <w:tc>
+          <w:tcPr>
+            <w:tcW w:type="dxa" w:w="2016"/>
+            <w:shd w:fill="F9FAFB"/>
+            <w:tcMar>
+              <w:top w:w="60" w:type="dxa"/>
+              <w:bottom w:w="60" w:type="dxa"/>
+              <w:left w:w="80" w:type="dxa"/>
+              <w:right w:w="80" w:type="dxa"/>
+            </w:tcMar>
+          </w:tcPr>
+          <w:p>
+            <w:r>
+              <w:rPr>
+                <w:sz w:val="15"/>
+              </w:rPr>
+              <w:t>transaksi, master_kendaraan, route_journeys, detail_route, tracking_events</w:t>
+            </w:r>
+          </w:p>
+        </w:tc>
+        <w:tc>
+          <w:tcPr>
+            <w:tcW w:type="dxa" w:w="1728"/>
+            <w:shd w:fill="F9FAFB"/>
+            <w:tcMar>
+              <w:top w:w="60" w:type="dxa"/>
+              <w:bottom w:w="60" w:type="dxa"/>
+              <w:left w:w="80" w:type="dxa"/>
+              <w:right w:w="80" w:type="dxa"/>
+            </w:tcMar>
+          </w:tcPr>
+          <w:p>
+            <w:r>
+              <w:rPr>
+                <w:sz w:val="15"/>
+              </w:rPr>
+              <w:t>Tab mode switch, date picker WIB, strict future date banner, live GPS tracking modal, CSV import.</w:t>
+            </w:r>
+          </w:p>
+        </w:tc>
+      </w:tr>
+      <w:tr>
+        <w:tc>
+          <w:tcPr>
+            <w:tcW w:type="dxa" w:w="2016"/>
+            <w:shd w:fill="FFFFFF"/>
+            <w:tcMar>
+              <w:top w:w="60" w:type="dxa"/>
+              <w:bottom w:w="60" w:type="dxa"/>
+              <w:left w:w="80" w:type="dxa"/>
+              <w:right w:w="80" w:type="dxa"/>
+            </w:tcMar>
+          </w:tcPr>
+          <w:p>
+            <w:r>
+              <w:rPr>
+                <w:b/>
+                <w:color w:val="003366"/>
+                <w:sz w:val="15"/>
+              </w:rPr>
+              <w:t>Modul 03 — Post Offices (Master Kantor)</w:t>
+            </w:r>
+          </w:p>
+        </w:tc>
+        <w:tc>
+          <w:tcPr>
+            <w:tcW w:type="dxa" w:w="1728"/>
+            <w:shd w:fill="FFFFFF"/>
+            <w:tcMar>
+              <w:top w:w="60" w:type="dxa"/>
+              <w:bottom w:w="60" w:type="dxa"/>
+              <w:left w:w="80" w:type="dxa"/>
+              <w:right w:w="80" w:type="dxa"/>
+            </w:tcMar>
+          </w:tcPr>
+          <w:p>
+            <w:r>
+              <w:rPr>
+                <w:sz w:val="15"/>
+              </w:rPr>
+              <w:t>Master Data (`/kantor`)</w:t>
+            </w:r>
+          </w:p>
+        </w:tc>
+        <w:tc>
+          <w:tcPr>
+            <w:tcW w:type="dxa" w:w="2304"/>
+            <w:shd w:fill="FFFFFF"/>
+            <w:tcMar>
+              <w:top w:w="60" w:type="dxa"/>
+              <w:bottom w:w="60" w:type="dxa"/>
+              <w:left w:w="80" w:type="dxa"/>
+              <w:right w:w="80" w:type="dxa"/>
+            </w:tcMar>
+          </w:tcPr>
+          <w:p>
+            <w:r>
+              <w:rPr>
+                <w:sz w:val="15"/>
+              </w:rPr>
+              <w:t>Direktori seluruh jaringan kantor pos nasional (KCU, KCP, KC, Agenpos, SPP DC) beserta koordinat lat/long.</w:t>
+            </w:r>
+          </w:p>
+        </w:tc>
+        <w:tc>
+          <w:tcPr>
+            <w:tcW w:type="dxa" w:w="2016"/>
+            <w:shd w:fill="FFFFFF"/>
+            <w:tcMar>
+              <w:top w:w="60" w:type="dxa"/>
+              <w:bottom w:w="60" w:type="dxa"/>
+              <w:left w:w="80" w:type="dxa"/>
+              <w:right w:w="80" w:type="dxa"/>
+            </w:tcMar>
+          </w:tcPr>
+          <w:p>
+            <w:r>
+              <w:rPr>
+                <w:sz w:val="15"/>
+              </w:rPr>
+              <w:t>master_kantor</w:t>
+            </w:r>
+          </w:p>
+        </w:tc>
+        <w:tc>
+          <w:tcPr>
+            <w:tcW w:type="dxa" w:w="1728"/>
+            <w:shd w:fill="FFFFFF"/>
+            <w:tcMar>
+              <w:top w:w="60" w:type="dxa"/>
+              <w:bottom w:w="60" w:type="dxa"/>
+              <w:left w:w="80" w:type="dxa"/>
+              <w:right w:w="80" w:type="dxa"/>
+            </w:tcMar>
+          </w:tcPr>
+          <w:p>
+            <w:r>
+              <w:rPr>
+                <w:sz w:val="15"/>
+              </w:rPr>
+              <w:t>Filter kategori hierarki, search bar nopend/nama/kota, modal detail profil, modal add/edit, export CSV.</w:t>
+            </w:r>
+          </w:p>
+        </w:tc>
+      </w:tr>
+      <w:tr>
+        <w:tc>
+          <w:tcPr>
+            <w:tcW w:type="dxa" w:w="2016"/>
+            <w:shd w:fill="F9FAFB"/>
+            <w:tcMar>
+              <w:top w:w="60" w:type="dxa"/>
+              <w:bottom w:w="60" w:type="dxa"/>
+              <w:left w:w="80" w:type="dxa"/>
+              <w:right w:w="80" w:type="dxa"/>
+            </w:tcMar>
+          </w:tcPr>
+          <w:p>
+            <w:r>
+              <w:rPr>
+                <w:b/>
+                <w:color w:val="003366"/>
+                <w:sz w:val="15"/>
+              </w:rPr>
+              <w:t>Modul 04 — Products &amp; Services (Produk)</w:t>
+            </w:r>
+          </w:p>
+        </w:tc>
+        <w:tc>
+          <w:tcPr>
+            <w:tcW w:type="dxa" w:w="1728"/>
+            <w:shd w:fill="F9FAFB"/>
+            <w:tcMar>
+              <w:top w:w="60" w:type="dxa"/>
+              <w:bottom w:w="60" w:type="dxa"/>
+              <w:left w:w="80" w:type="dxa"/>
+              <w:right w:w="80" w:type="dxa"/>
+            </w:tcMar>
+          </w:tcPr>
+          <w:p>
+            <w:r>
+              <w:rPr>
+                <w:sz w:val="15"/>
+              </w:rPr>
+              <w:t>Master Data (`/produk`)</w:t>
+            </w:r>
+          </w:p>
+        </w:tc>
+        <w:tc>
+          <w:tcPr>
+            <w:tcW w:type="dxa" w:w="2304"/>
+            <w:shd w:fill="F9FAFB"/>
+            <w:tcMar>
+              <w:top w:w="60" w:type="dxa"/>
+              <w:bottom w:w="60" w:type="dxa"/>
+              <w:left w:w="80" w:type="dxa"/>
+              <w:right w:w="80" w:type="dxa"/>
+            </w:tcMar>
+          </w:tcPr>
+          <w:p>
+            <w:r>
+              <w:rPr>
+                <w:sz w:val="15"/>
+              </w:rPr>
+              <w:t>Katalog layanan pengiriman kurir pos (Pos Ekspres, Reguler, Kilat Khusus, EMS, Logistik, Sameday) dan komitmen SLA.</w:t>
+            </w:r>
+          </w:p>
+        </w:tc>
+        <w:tc>
+          <w:tcPr>
+            <w:tcW w:type="dxa" w:w="2016"/>
+            <w:shd w:fill="F9FAFB"/>
+            <w:tcMar>
+              <w:top w:w="60" w:type="dxa"/>
+              <w:bottom w:w="60" w:type="dxa"/>
+              <w:left w:w="80" w:type="dxa"/>
+              <w:right w:w="80" w:type="dxa"/>
+            </w:tcMar>
+          </w:tcPr>
+          <w:p>
+            <w:r>
+              <w:rPr>
+                <w:sz w:val="15"/>
+              </w:rPr>
+              <w:t>master_produk</w:t>
+            </w:r>
+          </w:p>
+        </w:tc>
+        <w:tc>
+          <w:tcPr>
+            <w:tcW w:type="dxa" w:w="1728"/>
+            <w:shd w:fill="F9FAFB"/>
+            <w:tcMar>
+              <w:top w:w="60" w:type="dxa"/>
+              <w:bottom w:w="60" w:type="dxa"/>
+              <w:left w:w="80" w:type="dxa"/>
+              <w:right w:w="80" w:type="dxa"/>
+            </w:tcMar>
+          </w:tcPr>
+          <w:p>
+            <w:r>
+              <w:rPr>
+                <w:sz w:val="15"/>
+              </w:rPr>
+              <w:t>Toggle switch active/inactive, grid card produk, tombol tambah layanan produk baru.</w:t>
+            </w:r>
+          </w:p>
+        </w:tc>
+      </w:tr>
+      <w:tr>
+        <w:tc>
+          <w:tcPr>
+            <w:tcW w:type="dxa" w:w="2016"/>
+            <w:shd w:fill="FFFFFF"/>
+            <w:tcMar>
+              <w:top w:w="60" w:type="dxa"/>
+              <w:bottom w:w="60" w:type="dxa"/>
+              <w:left w:w="80" w:type="dxa"/>
+              <w:right w:w="80" w:type="dxa"/>
+            </w:tcMar>
+          </w:tcPr>
+          <w:p>
+            <w:r>
+              <w:rPr>
+                <w:b/>
+                <w:color w:val="003366"/>
+                <w:sz w:val="15"/>
+              </w:rPr>
+              <w:t>Modul 05 — Fleet Management (Armada)</w:t>
+            </w:r>
+          </w:p>
+        </w:tc>
+        <w:tc>
+          <w:tcPr>
+            <w:tcW w:type="dxa" w:w="1728"/>
+            <w:shd w:fill="FFFFFF"/>
+            <w:tcMar>
+              <w:top w:w="60" w:type="dxa"/>
+              <w:bottom w:w="60" w:type="dxa"/>
+              <w:left w:w="80" w:type="dxa"/>
+              <w:right w:w="80" w:type="dxa"/>
+            </w:tcMar>
+          </w:tcPr>
+          <w:p>
+            <w:r>
+              <w:rPr>
+                <w:sz w:val="15"/>
+              </w:rPr>
+              <w:t>Master Data (`/kendaraan`)</w:t>
+            </w:r>
+          </w:p>
+        </w:tc>
+        <w:tc>
+          <w:tcPr>
+            <w:tcW w:type="dxa" w:w="2304"/>
+            <w:shd w:fill="FFFFFF"/>
+            <w:tcMar>
+              <w:top w:w="60" w:type="dxa"/>
+              <w:bottom w:w="60" w:type="dxa"/>
+              <w:left w:w="80" w:type="dxa"/>
+              <w:right w:w="80" w:type="dxa"/>
+            </w:tcMar>
+          </w:tcPr>
+          <w:p>
+            <w:r>
+              <w:rPr>
+                <w:sz w:val="15"/>
+              </w:rPr>
+              <w:t>Manajemen armada mobil/truk pos, kapasitas maksimum kg/ton, nama driver, nomor kontak, homebase, dan rute penugasan.</w:t>
+            </w:r>
+          </w:p>
+        </w:tc>
+        <w:tc>
+          <w:tcPr>
+            <w:tcW w:type="dxa" w:w="2016"/>
+            <w:shd w:fill="FFFFFF"/>
+            <w:tcMar>
+              <w:top w:w="60" w:type="dxa"/>
+              <w:bottom w:w="60" w:type="dxa"/>
+              <w:left w:w="80" w:type="dxa"/>
+              <w:right w:w="80" w:type="dxa"/>
+            </w:tcMar>
+          </w:tcPr>
+          <w:p>
+            <w:r>
+              <w:rPr>
+                <w:sz w:val="15"/>
+              </w:rPr>
+              <w:t>master_kendaraan, route_journeys</w:t>
+            </w:r>
+          </w:p>
+        </w:tc>
+        <w:tc>
+          <w:tcPr>
+            <w:tcW w:type="dxa" w:w="1728"/>
+            <w:shd w:fill="FFFFFF"/>
+            <w:tcMar>
+              <w:top w:w="60" w:type="dxa"/>
+              <w:bottom w:w="60" w:type="dxa"/>
+              <w:left w:w="80" w:type="dxa"/>
+              <w:right w:w="80" w:type="dxa"/>
+            </w:tcMar>
+          </w:tcPr>
+          <w:p>
+            <w:r>
+              <w:rPr>
+                <w:sz w:val="15"/>
+              </w:rPr>
+              <w:t>Form collapsible drawer tambah armada, visual fleet cards, tombol pemicu VehicleDetailModal telemetri.</w:t>
+            </w:r>
+          </w:p>
+        </w:tc>
+      </w:tr>
+      <w:tr>
+        <w:tc>
+          <w:tcPr>
+            <w:tcW w:type="dxa" w:w="2016"/>
+            <w:shd w:fill="F9FAFB"/>
+            <w:tcMar>
+              <w:top w:w="60" w:type="dxa"/>
+              <w:bottom w:w="60" w:type="dxa"/>
+              <w:left w:w="80" w:type="dxa"/>
+              <w:right w:w="80" w:type="dxa"/>
+            </w:tcMar>
+          </w:tcPr>
+          <w:p>
+            <w:r>
+              <w:rPr>
+                <w:b/>
+                <w:color w:val="003366"/>
+                <w:sz w:val="15"/>
+              </w:rPr>
+              <w:t>Modul 06 — Routes Management (Rute)</w:t>
+            </w:r>
+          </w:p>
+        </w:tc>
+        <w:tc>
+          <w:tcPr>
+            <w:tcW w:type="dxa" w:w="1728"/>
+            <w:shd w:fill="F9FAFB"/>
+            <w:tcMar>
+              <w:top w:w="60" w:type="dxa"/>
+              <w:bottom w:w="60" w:type="dxa"/>
+              <w:left w:w="80" w:type="dxa"/>
+              <w:right w:w="80" w:type="dxa"/>
+            </w:tcMar>
+          </w:tcPr>
+          <w:p>
+            <w:r>
+              <w:rPr>
+                <w:sz w:val="15"/>
+              </w:rPr>
+              <w:t>Master Data (`/route`)</w:t>
+            </w:r>
+          </w:p>
+        </w:tc>
+        <w:tc>
+          <w:tcPr>
+            <w:tcW w:type="dxa" w:w="2304"/>
+            <w:shd w:fill="F9FAFB"/>
+            <w:tcMar>
+              <w:top w:w="60" w:type="dxa"/>
+              <w:bottom w:w="60" w:type="dxa"/>
+              <w:left w:w="80" w:type="dxa"/>
+              <w:right w:w="80" w:type="dxa"/>
+            </w:tcMar>
+          </w:tcPr>
+          <w:p>
+            <w:r>
+              <w:rPr>
+                <w:sz w:val="15"/>
+              </w:rPr>
+              <w:t>Pengelolaan master rute trayek logistik, waypoint singgah (detail_route), jarak tempuh KM, estimasi menit, dan prefix tujuan.</w:t>
+            </w:r>
+          </w:p>
+        </w:tc>
+        <w:tc>
+          <w:tcPr>
+            <w:tcW w:type="dxa" w:w="2016"/>
+            <w:shd w:fill="F9FAFB"/>
+            <w:tcMar>
+              <w:top w:w="60" w:type="dxa"/>
+              <w:bottom w:w="60" w:type="dxa"/>
+              <w:left w:w="80" w:type="dxa"/>
+              <w:right w:w="80" w:type="dxa"/>
+            </w:tcMar>
+          </w:tcPr>
+          <w:p>
+            <w:r>
+              <w:rPr>
+                <w:sz w:val="15"/>
+              </w:rPr>
+              <w:t>master_route_nopen, detail_route</w:t>
+            </w:r>
+          </w:p>
+        </w:tc>
+        <w:tc>
+          <w:tcPr>
+            <w:tcW w:type="dxa" w:w="1728"/>
+            <w:shd w:fill="F9FAFB"/>
+            <w:tcMar>
+              <w:top w:w="60" w:type="dxa"/>
+              <w:bottom w:w="60" w:type="dxa"/>
+              <w:left w:w="80" w:type="dxa"/>
+              <w:right w:w="80" w:type="dxa"/>
+            </w:tcMar>
+          </w:tcPr>
+          <w:p>
+            <w:r>
+              <w:rPr>
+                <w:sz w:val="15"/>
+              </w:rPr>
+              <w:t>Accordion expandable per rute, form builder rute baru, matriks jangkauan regional prefix 1-9.</w:t>
+            </w:r>
+          </w:p>
+        </w:tc>
+      </w:tr>
+      <w:tr>
+        <w:tc>
+          <w:tcPr>
+            <w:tcW w:type="dxa" w:w="2016"/>
+            <w:shd w:fill="FFFFFF"/>
+            <w:tcMar>
+              <w:top w:w="60" w:type="dxa"/>
+              <w:bottom w:w="60" w:type="dxa"/>
+              <w:left w:w="80" w:type="dxa"/>
+              <w:right w:w="80" w:type="dxa"/>
+            </w:tcMar>
+          </w:tcPr>
+          <w:p>
+            <w:r>
+              <w:rPr>
+                <w:b/>
+                <w:color w:val="003366"/>
+                <w:sz w:val="15"/>
+              </w:rPr>
+              <w:t>Modul 07 — Schedule Templates (Template)</w:t>
+            </w:r>
+          </w:p>
+        </w:tc>
+        <w:tc>
+          <w:tcPr>
+            <w:tcW w:type="dxa" w:w="1728"/>
+            <w:shd w:fill="FFFFFF"/>
+            <w:tcMar>
+              <w:top w:w="60" w:type="dxa"/>
+              <w:bottom w:w="60" w:type="dxa"/>
+              <w:left w:w="80" w:type="dxa"/>
+              <w:right w:w="80" w:type="dxa"/>
+            </w:tcMar>
+          </w:tcPr>
+          <w:p>
+            <w:r>
+              <w:rPr>
+                <w:sz w:val="15"/>
+              </w:rPr>
+              <w:t>Logistics (`/template`)</w:t>
+            </w:r>
+          </w:p>
+        </w:tc>
+        <w:tc>
+          <w:tcPr>
+            <w:tcW w:type="dxa" w:w="2304"/>
+            <w:shd w:fill="FFFFFF"/>
+            <w:tcMar>
+              <w:top w:w="60" w:type="dxa"/>
+              <w:bottom w:w="60" w:type="dxa"/>
+              <w:left w:w="80" w:type="dxa"/>
+              <w:right w:w="80" w:type="dxa"/>
+            </w:tcMar>
+          </w:tcPr>
+          <w:p>
+            <w:r>
+              <w:rPr>
+                <w:sz w:val="15"/>
+              </w:rPr>
+              <w:t>Pola cetak biru jadwal mingguan (hari aktif Sen-Min, jam berangkat acuan, armada acuan, rute acuan).</w:t>
+            </w:r>
+          </w:p>
+        </w:tc>
+        <w:tc>
+          <w:tcPr>
+            <w:tcW w:type="dxa" w:w="2016"/>
+            <w:shd w:fill="FFFFFF"/>
+            <w:tcMar>
+              <w:top w:w="60" w:type="dxa"/>
+              <w:bottom w:w="60" w:type="dxa"/>
+              <w:left w:w="80" w:type="dxa"/>
+              <w:right w:w="80" w:type="dxa"/>
+            </w:tcMar>
+          </w:tcPr>
+          <w:p>
+            <w:r>
+              <w:rPr>
+                <w:sz w:val="15"/>
+              </w:rPr>
+              <w:t>template_jadwal_transportasi, master_kendaraan</w:t>
+            </w:r>
+          </w:p>
+        </w:tc>
+        <w:tc>
+          <w:tcPr>
+            <w:tcW w:type="dxa" w:w="1728"/>
+            <w:shd w:fill="FFFFFF"/>
+            <w:tcMar>
+              <w:top w:w="60" w:type="dxa"/>
+              <w:bottom w:w="60" w:type="dxa"/>
+              <w:left w:w="80" w:type="dxa"/>
+              <w:right w:w="80" w:type="dxa"/>
+            </w:tcMar>
+          </w:tcPr>
+          <w:p>
+            <w:r>
+              <w:rPr>
+                <w:sz w:val="15"/>
+              </w:rPr>
+              <w:t>Toggle active template, filter shift operasional, tombol pemicu generate jadwal harian.</w:t>
+            </w:r>
+          </w:p>
+        </w:tc>
+      </w:tr>
+      <w:tr>
+        <w:tc>
+          <w:tcPr>
+            <w:tcW w:type="dxa" w:w="2016"/>
+            <w:shd w:fill="F9FAFB"/>
+            <w:tcMar>
+              <w:top w:w="60" w:type="dxa"/>
+              <w:bottom w:w="60" w:type="dxa"/>
+              <w:left w:w="80" w:type="dxa"/>
+              <w:right w:w="80" w:type="dxa"/>
+            </w:tcMar>
+          </w:tcPr>
+          <w:p>
+            <w:r>
+              <w:rPr>
+                <w:b/>
+                <w:color w:val="003366"/>
+                <w:sz w:val="15"/>
+              </w:rPr>
+              <w:t>Modul 08 — Transport Schedule (Jadwal)</w:t>
+            </w:r>
+          </w:p>
+        </w:tc>
+        <w:tc>
+          <w:tcPr>
+            <w:tcW w:type="dxa" w:w="1728"/>
+            <w:shd w:fill="F9FAFB"/>
+            <w:tcMar>
+              <w:top w:w="60" w:type="dxa"/>
+              <w:bottom w:w="60" w:type="dxa"/>
+              <w:left w:w="80" w:type="dxa"/>
+              <w:right w:w="80" w:type="dxa"/>
+            </w:tcMar>
+          </w:tcPr>
+          <w:p>
+            <w:r>
+              <w:rPr>
+                <w:sz w:val="15"/>
+              </w:rPr>
+              <w:t>Logistics (`/jadwal`)</w:t>
+            </w:r>
+          </w:p>
+        </w:tc>
+        <w:tc>
+          <w:tcPr>
+            <w:tcW w:type="dxa" w:w="2304"/>
+            <w:shd w:fill="F9FAFB"/>
+            <w:tcMar>
+              <w:top w:w="60" w:type="dxa"/>
+              <w:bottom w:w="60" w:type="dxa"/>
+              <w:left w:w="80" w:type="dxa"/>
+              <w:right w:w="80" w:type="dxa"/>
+            </w:tcMar>
+          </w:tcPr>
+          <w:p>
+            <w:r>
+              <w:rPr>
+                <w:sz w:val="15"/>
+              </w:rPr>
+              <w:t>Eksekusi jadwal transportasi riil per tanggal operasional dengan kalender mingguan visual jam 06:00-18:00 WIB.</w:t>
+            </w:r>
+          </w:p>
+        </w:tc>
+        <w:tc>
+          <w:tcPr>
+            <w:tcW w:type="dxa" w:w="2016"/>
+            <w:shd w:fill="F9FAFB"/>
+            <w:tcMar>
+              <w:top w:w="60" w:type="dxa"/>
+              <w:bottom w:w="60" w:type="dxa"/>
+              <w:left w:w="80" w:type="dxa"/>
+              <w:right w:w="80" w:type="dxa"/>
+            </w:tcMar>
+          </w:tcPr>
+          <w:p>
+            <w:r>
+              <w:rPr>
+                <w:sz w:val="15"/>
+              </w:rPr>
+              <w:t>jadwal_transportasi, master_kendaraan</w:t>
+            </w:r>
+          </w:p>
+        </w:tc>
+        <w:tc>
+          <w:tcPr>
+            <w:tcW w:type="dxa" w:w="1728"/>
+            <w:shd w:fill="F9FAFB"/>
+            <w:tcMar>
+              <w:top w:w="60" w:type="dxa"/>
+              <w:bottom w:w="60" w:type="dxa"/>
+              <w:left w:w="80" w:type="dxa"/>
+              <w:right w:w="80" w:type="dxa"/>
+            </w:tcMar>
+          </w:tcPr>
+          <w:p>
+            <w:r>
+              <w:rPr>
+                <w:sz w:val="15"/>
+              </w:rPr>
+              <w:t>Navigasi minggu (&lt; Week &gt;), generator jadwal massal dengan progress bar %, visual timetable grid.</w:t>
+            </w:r>
+          </w:p>
+        </w:tc>
+      </w:tr>
+      <w:tr>
+        <w:tc>
+          <w:tcPr>
+            <w:tcW w:type="dxa" w:w="2016"/>
+            <w:shd w:fill="FFFFFF"/>
+            <w:tcMar>
+              <w:top w:w="60" w:type="dxa"/>
+              <w:bottom w:w="60" w:type="dxa"/>
+              <w:left w:w="80" w:type="dxa"/>
+              <w:right w:w="80" w:type="dxa"/>
+            </w:tcMar>
+          </w:tcPr>
+          <w:p>
+            <w:r>
+              <w:rPr>
+                <w:b/>
+                <w:color w:val="003366"/>
+                <w:sz w:val="15"/>
+              </w:rPr>
+              <w:t>Modul 09 — Milk Run Telemetry</w:t>
+            </w:r>
+          </w:p>
+        </w:tc>
+        <w:tc>
+          <w:tcPr>
+            <w:tcW w:type="dxa" w:w="1728"/>
+            <w:shd w:fill="FFFFFF"/>
+            <w:tcMar>
+              <w:top w:w="60" w:type="dxa"/>
+              <w:bottom w:w="60" w:type="dxa"/>
+              <w:left w:w="80" w:type="dxa"/>
+              <w:right w:w="80" w:type="dxa"/>
+            </w:tcMar>
+          </w:tcPr>
+          <w:p>
+            <w:r>
+              <w:rPr>
+                <w:sz w:val="15"/>
+              </w:rPr>
+              <w:t>Logistics (`/route-journey`)</w:t>
+            </w:r>
+          </w:p>
+        </w:tc>
+        <w:tc>
+          <w:tcPr>
+            <w:tcW w:type="dxa" w:w="2304"/>
+            <w:shd w:fill="FFFFFF"/>
+            <w:tcMar>
+              <w:top w:w="60" w:type="dxa"/>
+              <w:bottom w:w="60" w:type="dxa"/>
+              <w:left w:w="80" w:type="dxa"/>
+              <w:right w:w="80" w:type="dxa"/>
+            </w:tcMar>
+          </w:tcPr>
+          <w:p>
+            <w:r>
+              <w:rPr>
+                <w:sz w:val="15"/>
+              </w:rPr>
+              <w:t>Simulasi &amp; eksekusi perjalanan multi-stop armada feeder dengan kalkulasi muatan bertahap, status stop, dan ACID lock.</w:t>
+            </w:r>
+          </w:p>
+        </w:tc>
+        <w:tc>
+          <w:tcPr>
+            <w:tcW w:type="dxa" w:w="2016"/>
+            <w:shd w:fill="FFFFFF"/>
+            <w:tcMar>
+              <w:top w:w="60" w:type="dxa"/>
+              <w:bottom w:w="60" w:type="dxa"/>
+              <w:left w:w="80" w:type="dxa"/>
+              <w:right w:w="80" w:type="dxa"/>
+            </w:tcMar>
+          </w:tcPr>
+          <w:p>
+            <w:r>
+              <w:rPr>
+                <w:sz w:val="15"/>
+              </w:rPr>
+              <w:t>route_journeys, detail_route, transaksi</w:t>
+            </w:r>
+          </w:p>
+        </w:tc>
+        <w:tc>
+          <w:tcPr>
+            <w:tcW w:type="dxa" w:w="1728"/>
+            <w:shd w:fill="FFFFFF"/>
+            <w:tcMar>
+              <w:top w:w="60" w:type="dxa"/>
+              <w:bottom w:w="60" w:type="dxa"/>
+              <w:left w:w="80" w:type="dxa"/>
+              <w:right w:w="80" w:type="dxa"/>
+            </w:tcMar>
+          </w:tcPr>
+          <w:p>
+            <w:r>
+              <w:rPr>
+                <w:sz w:val="15"/>
+              </w:rPr>
+              <w:t>Tombol kontrol eksekusi stop berikutnya, reset rute, live capacity meter, manifest stop inspection.</w:t>
+            </w:r>
+          </w:p>
+        </w:tc>
+      </w:tr>
+      <w:tr>
+        <w:tc>
+          <w:tcPr>
+            <w:tcW w:type="dxa" w:w="2016"/>
+            <w:shd w:fill="F9FAFB"/>
+            <w:tcMar>
+              <w:top w:w="60" w:type="dxa"/>
+              <w:bottom w:w="60" w:type="dxa"/>
+              <w:left w:w="80" w:type="dxa"/>
+              <w:right w:w="80" w:type="dxa"/>
+            </w:tcMar>
+          </w:tcPr>
+          <w:p>
+            <w:r>
+              <w:rPr>
+                <w:b/>
+                <w:color w:val="003366"/>
+                <w:sz w:val="15"/>
+              </w:rPr>
+              <w:t>Modul 10 — Estimasi Milk Run</w:t>
+            </w:r>
+          </w:p>
+        </w:tc>
+        <w:tc>
+          <w:tcPr>
+            <w:tcW w:type="dxa" w:w="1728"/>
+            <w:shd w:fill="F9FAFB"/>
+            <w:tcMar>
+              <w:top w:w="60" w:type="dxa"/>
+              <w:bottom w:w="60" w:type="dxa"/>
+              <w:left w:w="80" w:type="dxa"/>
+              <w:right w:w="80" w:type="dxa"/>
+            </w:tcMar>
+          </w:tcPr>
+          <w:p>
+            <w:r>
+              <w:rPr>
+                <w:sz w:val="15"/>
+              </w:rPr>
+              <w:t>Logistics (`/estimasi`)</w:t>
+            </w:r>
+          </w:p>
+        </w:tc>
+        <w:tc>
+          <w:tcPr>
+            <w:tcW w:type="dxa" w:w="2304"/>
+            <w:shd w:fill="F9FAFB"/>
+            <w:tcMar>
+              <w:top w:w="60" w:type="dxa"/>
+              <w:bottom w:w="60" w:type="dxa"/>
+              <w:left w:w="80" w:type="dxa"/>
+              <w:right w:w="80" w:type="dxa"/>
+            </w:tcMar>
+          </w:tcPr>
+          <w:p>
+            <w:r>
+              <w:rPr>
+                <w:sz w:val="15"/>
+              </w:rPr>
+              <w:t>Kalkulator dan perencana estimasi waktu tempuh (ETA), akumulasi KM, dan simulasi muatan truk animasi interaktif.</w:t>
+            </w:r>
+          </w:p>
+        </w:tc>
+        <w:tc>
+          <w:tcPr>
+            <w:tcW w:type="dxa" w:w="2016"/>
+            <w:shd w:fill="F9FAFB"/>
+            <w:tcMar>
+              <w:top w:w="60" w:type="dxa"/>
+              <w:bottom w:w="60" w:type="dxa"/>
+              <w:left w:w="80" w:type="dxa"/>
+              <w:right w:w="80" w:type="dxa"/>
+            </w:tcMar>
+          </w:tcPr>
+          <w:p>
+            <w:r>
+              <w:rPr>
+                <w:sz w:val="15"/>
+              </w:rPr>
+              <w:t>detail_route, master_route_nopen, master_kantor</w:t>
+            </w:r>
+          </w:p>
+        </w:tc>
+        <w:tc>
+          <w:tcPr>
+            <w:tcW w:type="dxa" w:w="1728"/>
+            <w:shd w:fill="F9FAFB"/>
+            <w:tcMar>
+              <w:top w:w="60" w:type="dxa"/>
+              <w:bottom w:w="60" w:type="dxa"/>
+              <w:left w:w="80" w:type="dxa"/>
+              <w:right w:w="80" w:type="dxa"/>
+            </w:tcMar>
+          </w:tcPr>
+          <w:p>
+            <w:r>
+              <w:rPr>
+                <w:sz w:val="15"/>
+              </w:rPr>
+              <w:t>Play/pause auto simulation, truk animasi roda berputar, popup rincian bukti tanda tangan pengambilan.</w:t>
+            </w:r>
+          </w:p>
+        </w:tc>
+      </w:tr>
+      <w:tr>
+        <w:tc>
+          <w:tcPr>
+            <w:tcW w:type="dxa" w:w="2016"/>
+            <w:shd w:fill="FFFFFF"/>
+            <w:tcMar>
+              <w:top w:w="60" w:type="dxa"/>
+              <w:bottom w:w="60" w:type="dxa"/>
+              <w:left w:w="80" w:type="dxa"/>
+              <w:right w:w="80" w:type="dxa"/>
+            </w:tcMar>
+          </w:tcPr>
+          <w:p>
+            <w:r>
+              <w:rPr>
+                <w:b/>
+                <w:color w:val="003366"/>
+                <w:sz w:val="15"/>
+              </w:rPr>
+              <w:t>Modul 11 — Gate Monitoring Transit</w:t>
+            </w:r>
+          </w:p>
+        </w:tc>
+        <w:tc>
+          <w:tcPr>
+            <w:tcW w:type="dxa" w:w="1728"/>
+            <w:shd w:fill="FFFFFF"/>
+            <w:tcMar>
+              <w:top w:w="60" w:type="dxa"/>
+              <w:bottom w:w="60" w:type="dxa"/>
+              <w:left w:w="80" w:type="dxa"/>
+              <w:right w:w="80" w:type="dxa"/>
+            </w:tcMar>
+          </w:tcPr>
+          <w:p>
+            <w:r>
+              <w:rPr>
+                <w:sz w:val="15"/>
+              </w:rPr>
+              <w:t>Logistics (`/transit-monitoring`)</w:t>
+            </w:r>
+          </w:p>
+        </w:tc>
+        <w:tc>
+          <w:tcPr>
+            <w:tcW w:type="dxa" w:w="2304"/>
+            <w:shd w:fill="FFFFFF"/>
+            <w:tcMar>
+              <w:top w:w="60" w:type="dxa"/>
+              <w:bottom w:w="60" w:type="dxa"/>
+              <w:left w:w="80" w:type="dxa"/>
+              <w:right w:w="80" w:type="dxa"/>
+            </w:tcMar>
+          </w:tcPr>
+          <w:p>
+            <w:r>
+              <w:rPr>
+                <w:sz w:val="15"/>
+              </w:rPr>
+              <w:t>Pemantauan 3-stage transit pipeline: 1. Manifest Creation -&gt; 2. In-Flight Transit -&gt; 3. Gate SPP Unloading.</w:t>
+            </w:r>
+          </w:p>
+        </w:tc>
+        <w:tc>
+          <w:tcPr>
+            <w:tcW w:type="dxa" w:w="2016"/>
+            <w:shd w:fill="FFFFFF"/>
+            <w:tcMar>
+              <w:top w:w="60" w:type="dxa"/>
+              <w:bottom w:w="60" w:type="dxa"/>
+              <w:left w:w="80" w:type="dxa"/>
+              <w:right w:w="80" w:type="dxa"/>
+            </w:tcMar>
+          </w:tcPr>
+          <w:p>
+            <w:r>
+              <w:rPr>
+                <w:sz w:val="15"/>
+              </w:rPr>
+              <w:t>transaksi, route_journeys, tracking_events</w:t>
+            </w:r>
+          </w:p>
+        </w:tc>
+        <w:tc>
+          <w:tcPr>
+            <w:tcW w:type="dxa" w:w="1728"/>
+            <w:shd w:fill="FFFFFF"/>
+            <w:tcMar>
+              <w:top w:w="60" w:type="dxa"/>
+              <w:bottom w:w="60" w:type="dxa"/>
+              <w:left w:w="80" w:type="dxa"/>
+              <w:right w:w="80" w:type="dxa"/>
+            </w:tcMar>
+          </w:tcPr>
+          <w:p>
+            <w:r>
+              <w:rPr>
+                <w:sz w:val="15"/>
+              </w:rPr>
+              <w:t>Batch select checkbox resi, tombol dispatch armada, tombol finalisasi bongkar, polling auto-refresh 3.5s.</w:t>
+            </w:r>
+          </w:p>
+        </w:tc>
+      </w:tr>
+      <w:tr>
+        <w:tc>
+          <w:tcPr>
+            <w:tcW w:type="dxa" w:w="2016"/>
+            <w:shd w:fill="F9FAFB"/>
+            <w:tcMar>
+              <w:top w:w="60" w:type="dxa"/>
+              <w:bottom w:w="60" w:type="dxa"/>
+              <w:left w:w="80" w:type="dxa"/>
+              <w:right w:w="80" w:type="dxa"/>
+            </w:tcMar>
+          </w:tcPr>
+          <w:p>
+            <w:r>
+              <w:rPr>
+                <w:b/>
+                <w:color w:val="003366"/>
+                <w:sz w:val="15"/>
+              </w:rPr>
+              <w:t>Modul 12 — Analitik SLA &amp; Laporan</w:t>
+            </w:r>
+          </w:p>
+        </w:tc>
+        <w:tc>
+          <w:tcPr>
+            <w:tcW w:type="dxa" w:w="1728"/>
+            <w:shd w:fill="F9FAFB"/>
+            <w:tcMar>
+              <w:top w:w="60" w:type="dxa"/>
+              <w:bottom w:w="60" w:type="dxa"/>
+              <w:left w:w="80" w:type="dxa"/>
+              <w:right w:w="80" w:type="dxa"/>
+            </w:tcMar>
+          </w:tcPr>
+          <w:p>
+            <w:r>
+              <w:rPr>
+                <w:sz w:val="15"/>
+              </w:rPr>
+              <w:t>Reporting (`/analytics`)</w:t>
+            </w:r>
+          </w:p>
+        </w:tc>
+        <w:tc>
+          <w:tcPr>
+            <w:tcW w:type="dxa" w:w="2304"/>
+            <w:shd w:fill="F9FAFB"/>
+            <w:tcMar>
+              <w:top w:w="60" w:type="dxa"/>
+              <w:bottom w:w="60" w:type="dxa"/>
+              <w:left w:w="80" w:type="dxa"/>
+              <w:right w:w="80" w:type="dxa"/>
+            </w:tcMar>
+          </w:tcPr>
+          <w:p>
+            <w:r>
+              <w:rPr>
+                <w:sz w:val="15"/>
+              </w:rPr>
+              <w:t>Analisis performa SLA pengiriman regional (skala Y 0%-100%), throughput tonase muatan, breakdown produk, dan ekspor CSV.</w:t>
+            </w:r>
+          </w:p>
+        </w:tc>
+        <w:tc>
+          <w:tcPr>
+            <w:tcW w:type="dxa" w:w="2016"/>
+            <w:shd w:fill="F9FAFB"/>
+            <w:tcMar>
+              <w:top w:w="60" w:type="dxa"/>
+              <w:bottom w:w="60" w:type="dxa"/>
+              <w:left w:w="80" w:type="dxa"/>
+              <w:right w:w="80" w:type="dxa"/>
+            </w:tcMar>
+          </w:tcPr>
+          <w:p>
+            <w:r>
+              <w:rPr>
+                <w:sz w:val="15"/>
+              </w:rPr>
+              <w:t>transaksi, route_journeys, master_kendaraan</w:t>
+            </w:r>
+          </w:p>
+        </w:tc>
+        <w:tc>
+          <w:tcPr>
+            <w:tcW w:type="dxa" w:w="1728"/>
+            <w:shd w:fill="F9FAFB"/>
+            <w:tcMar>
+              <w:top w:w="60" w:type="dxa"/>
+              <w:bottom w:w="60" w:type="dxa"/>
+              <w:left w:w="80" w:type="dxa"/>
+              <w:right w:w="80" w:type="dxa"/>
+            </w:tcMar>
+          </w:tcPr>
+          <w:p>
+            <w:r>
+              <w:rPr>
+                <w:sz w:val="15"/>
+              </w:rPr>
+              <w:t>Interactive line chart dengan tooltip hover, date range slider, filter multi-dropdown, tombol cetak &amp; CSV.</w:t>
+            </w:r>
+          </w:p>
+        </w:tc>
+      </w:tr>
+      <w:tr>
+        <w:tc>
+          <w:tcPr>
+            <w:tcW w:type="dxa" w:w="2016"/>
+            <w:shd w:fill="FFFFFF"/>
+            <w:tcMar>
+              <w:top w:w="60" w:type="dxa"/>
+              <w:bottom w:w="60" w:type="dxa"/>
+              <w:left w:w="80" w:type="dxa"/>
+              <w:right w:w="80" w:type="dxa"/>
+            </w:tcMar>
+          </w:tcPr>
+          <w:p>
+            <w:r>
+              <w:rPr>
+                <w:b/>
+                <w:color w:val="003366"/>
+                <w:sz w:val="15"/>
+              </w:rPr>
+              <w:t>Modul 13 — Database Viewer Transaksi</w:t>
+            </w:r>
+          </w:p>
+        </w:tc>
+        <w:tc>
+          <w:tcPr>
+            <w:tcW w:type="dxa" w:w="1728"/>
+            <w:shd w:fill="FFFFFF"/>
+            <w:tcMar>
+              <w:top w:w="60" w:type="dxa"/>
+              <w:bottom w:w="60" w:type="dxa"/>
+              <w:left w:w="80" w:type="dxa"/>
+              <w:right w:w="80" w:type="dxa"/>
+            </w:tcMar>
+          </w:tcPr>
+          <w:p>
+            <w:r>
+              <w:rPr>
+                <w:sz w:val="15"/>
+              </w:rPr>
+              <w:t>System Data (`/transaksi`)</w:t>
+            </w:r>
+          </w:p>
+        </w:tc>
+        <w:tc>
+          <w:tcPr>
+            <w:tcW w:type="dxa" w:w="2304"/>
+            <w:shd w:fill="FFFFFF"/>
+            <w:tcMar>
+              <w:top w:w="60" w:type="dxa"/>
+              <w:bottom w:w="60" w:type="dxa"/>
+              <w:left w:w="80" w:type="dxa"/>
+              <w:right w:w="80" w:type="dxa"/>
+            </w:tcMar>
+          </w:tcPr>
+          <w:p>
+            <w:r>
+              <w:rPr>
+                <w:sz w:val="15"/>
+              </w:rPr>
+              <w:t>Penjelajah data mentah resi kiriman di MongoDB dengan multi-filter lengkap, server-side pagination, dan modal audit.</w:t>
+            </w:r>
+          </w:p>
+        </w:tc>
+        <w:tc>
+          <w:tcPr>
+            <w:tcW w:type="dxa" w:w="2016"/>
+            <w:shd w:fill="FFFFFF"/>
+            <w:tcMar>
+              <w:top w:w="60" w:type="dxa"/>
+              <w:bottom w:w="60" w:type="dxa"/>
+              <w:left w:w="80" w:type="dxa"/>
+              <w:right w:w="80" w:type="dxa"/>
+            </w:tcMar>
+          </w:tcPr>
+          <w:p>
+            <w:r>
+              <w:rPr>
+                <w:sz w:val="15"/>
+              </w:rPr>
+              <w:t>transaksi, master_kantor</w:t>
+            </w:r>
+          </w:p>
+        </w:tc>
+        <w:tc>
+          <w:tcPr>
+            <w:tcW w:type="dxa" w:w="1728"/>
+            <w:shd w:fill="FFFFFF"/>
+            <w:tcMar>
+              <w:top w:w="60" w:type="dxa"/>
+              <w:bottom w:w="60" w:type="dxa"/>
+              <w:left w:w="80" w:type="dxa"/>
+              <w:right w:w="80" w:type="dxa"/>
+            </w:tcMar>
+          </w:tcPr>
+          <w:p>
+            <w:r>
+              <w:rPr>
+                <w:sz w:val="15"/>
+              </w:rPr>
+              <w:t>Debounced search, filter status, layanan, nopend tujuan, KPRK, regional, tanggal, modal raw JSON &amp; fleet.</w:t>
+            </w:r>
+          </w:p>
+        </w:tc>
+      </w:tr>
+      <w:tr>
+        <w:tc>
+          <w:tcPr>
+            <w:tcW w:type="dxa" w:w="2016"/>
+            <w:shd w:fill="F9FAFB"/>
+            <w:tcMar>
+              <w:top w:w="60" w:type="dxa"/>
+              <w:bottom w:w="60" w:type="dxa"/>
+              <w:left w:w="80" w:type="dxa"/>
+              <w:right w:w="80" w:type="dxa"/>
+            </w:tcMar>
+          </w:tcPr>
+          <w:p>
+            <w:r>
+              <w:rPr>
+                <w:b/>
+                <w:color w:val="003366"/>
+                <w:sz w:val="15"/>
+              </w:rPr>
+              <w:t>Modul 14 — System Settings &amp; Compass</w:t>
+            </w:r>
+          </w:p>
+        </w:tc>
+        <w:tc>
+          <w:tcPr>
+            <w:tcW w:type="dxa" w:w="1728"/>
+            <w:shd w:fill="F9FAFB"/>
+            <w:tcMar>
+              <w:top w:w="60" w:type="dxa"/>
+              <w:bottom w:w="60" w:type="dxa"/>
+              <w:left w:w="80" w:type="dxa"/>
+              <w:right w:w="80" w:type="dxa"/>
+            </w:tcMar>
+          </w:tcPr>
+          <w:p>
+            <w:r>
+              <w:rPr>
+                <w:sz w:val="15"/>
+              </w:rPr>
+              <w:t>System Config (`/settings`)</w:t>
+            </w:r>
+          </w:p>
+        </w:tc>
+        <w:tc>
+          <w:tcPr>
+            <w:tcW w:type="dxa" w:w="2304"/>
+            <w:shd w:fill="F9FAFB"/>
+            <w:tcMar>
+              <w:top w:w="60" w:type="dxa"/>
+              <w:bottom w:w="60" w:type="dxa"/>
+              <w:left w:w="80" w:type="dxa"/>
+              <w:right w:w="80" w:type="dxa"/>
+            </w:tcMar>
+          </w:tcPr>
+          <w:p>
+            <w:r>
+              <w:rPr>
+                <w:sz w:val="15"/>
+              </w:rPr>
+              <w:t>Manajemen koneksi database MongoDB multi-server (Primary Remote 192.168.5.219 vs Local 127.0.0.1), ping test, dan security.</w:t>
+            </w:r>
+          </w:p>
+        </w:tc>
+        <w:tc>
+          <w:tcPr>
+            <w:tcW w:type="dxa" w:w="2016"/>
+            <w:shd w:fill="F9FAFB"/>
+            <w:tcMar>
+              <w:top w:w="60" w:type="dxa"/>
+              <w:bottom w:w="60" w:type="dxa"/>
+              <w:left w:w="80" w:type="dxa"/>
+              <w:right w:w="80" w:type="dxa"/>
+            </w:tcMar>
+          </w:tcPr>
+          <w:p>
+            <w:r>
+              <w:rPr>
+                <w:sz w:val="15"/>
+              </w:rPr>
+              <w:t>connections.json, DbConnection.js</w:t>
+            </w:r>
+          </w:p>
+        </w:tc>
+        <w:tc>
+          <w:tcPr>
+            <w:tcW w:type="dxa" w:w="1728"/>
+            <w:shd w:fill="F9FAFB"/>
+            <w:tcMar>
+              <w:top w:w="60" w:type="dxa"/>
+              <w:bottom w:w="60" w:type="dxa"/>
+              <w:left w:w="80" w:type="dxa"/>
+              <w:right w:w="80" w:type="dxa"/>
+            </w:tcMar>
+          </w:tcPr>
+          <w:p>
+            <w:r>
+              <w:rPr>
+                <w:sz w:val="15"/>
+              </w:rPr>
+              <w:t>Input URI dengan toggle masking mata, tombol test connection, preset cluster switcher, TLS config.</w:t>
+            </w:r>
+          </w:p>
+        </w:tc>
+      </w:tr>
+      <w:tr>
+        <w:tc>
+          <w:tcPr>
+            <w:tcW w:type="dxa" w:w="2016"/>
+            <w:shd w:fill="FFFFFF"/>
+            <w:tcMar>
+              <w:top w:w="60" w:type="dxa"/>
+              <w:bottom w:w="60" w:type="dxa"/>
+              <w:left w:w="80" w:type="dxa"/>
+              <w:right w:w="80" w:type="dxa"/>
+            </w:tcMar>
+          </w:tcPr>
+          <w:p>
+            <w:r>
+              <w:rPr>
+                <w:b/>
+                <w:color w:val="003366"/>
+                <w:sz w:val="15"/>
+              </w:rPr>
+              <w:t>Modul 15 — User Profile &amp; Account</w:t>
+            </w:r>
+          </w:p>
+        </w:tc>
+        <w:tc>
+          <w:tcPr>
+            <w:tcW w:type="dxa" w:w="1728"/>
+            <w:shd w:fill="FFFFFF"/>
+            <w:tcMar>
+              <w:top w:w="60" w:type="dxa"/>
+              <w:bottom w:w="60" w:type="dxa"/>
+              <w:left w:w="80" w:type="dxa"/>
+              <w:right w:w="80" w:type="dxa"/>
+            </w:tcMar>
+          </w:tcPr>
+          <w:p>
+            <w:r>
+              <w:rPr>
+                <w:sz w:val="15"/>
+              </w:rPr>
+              <w:t>Account (`/profile`)</w:t>
+            </w:r>
+          </w:p>
+        </w:tc>
+        <w:tc>
+          <w:tcPr>
+            <w:tcW w:type="dxa" w:w="2304"/>
+            <w:shd w:fill="FFFFFF"/>
+            <w:tcMar>
+              <w:top w:w="60" w:type="dxa"/>
+              <w:bottom w:w="60" w:type="dxa"/>
+              <w:left w:w="80" w:type="dxa"/>
+              <w:right w:w="80" w:type="dxa"/>
+            </w:tcMar>
+          </w:tcPr>
+          <w:p>
+            <w:r>
+              <w:rPr>
+                <w:sz w:val="15"/>
+              </w:rPr>
+              <w:t>Manajemen profil personel, NIP pegawai pos, unit kantor penugasan, ubah password akun, dan log audit sesi login.</w:t>
+            </w:r>
+          </w:p>
+        </w:tc>
+        <w:tc>
+          <w:tcPr>
+            <w:tcW w:type="dxa" w:w="2016"/>
+            <w:shd w:fill="FFFFFF"/>
+            <w:tcMar>
+              <w:top w:w="60" w:type="dxa"/>
+              <w:bottom w:w="60" w:type="dxa"/>
+              <w:left w:w="80" w:type="dxa"/>
+              <w:right w:w="80" w:type="dxa"/>
+            </w:tcMar>
+          </w:tcPr>
+          <w:p>
+            <w:r>
+              <w:rPr>
+                <w:sz w:val="15"/>
+              </w:rPr>
+              <w:t>users</w:t>
+            </w:r>
+          </w:p>
+        </w:tc>
+        <w:tc>
+          <w:tcPr>
+            <w:tcW w:type="dxa" w:w="1728"/>
+            <w:shd w:fill="FFFFFF"/>
+            <w:tcMar>
+              <w:top w:w="60" w:type="dxa"/>
+              <w:bottom w:w="60" w:type="dxa"/>
+              <w:left w:w="80" w:type="dxa"/>
+              <w:right w:w="80" w:type="dxa"/>
+            </w:tcMar>
+          </w:tcPr>
+          <w:p>
+            <w:r>
+              <w:rPr>
+                <w:sz w:val="15"/>
+              </w:rPr>
+              <w:t>Form edit profil, form ubah kata sandi, status 2FA, tabel riwayat sesi aktivitas IP/browser.</w:t>
+            </w:r>
+          </w:p>
+        </w:tc>
+      </w:tr>
+    </w:tbl>
+    <w:p/>
     <w:p>
       <w:pPr>
-        <w:spacing w:after="80" w:line="276" w:lineRule="auto"/>
-      </w:pPr>
-      <w:r>
-        <w:rPr>
-          <w:rFonts w:ascii="Arial" w:hAnsi="Arial"/>
-          <w:color w:val="334155"/>
-          <w:sz w:val="19"/>
-        </w:rPr>
-        <w:t>Berikut adalah daftar lengkap 15 modul halaman aplikasi IPOS5 beserta URL route dan file komponen React pendukung:</w:t>
-      </w:r>
-    </w:p>
-    <w:p>
-      <w:pPr>
-        <w:spacing w:after="80" w:line="276" w:lineRule="auto"/>
-        <w:ind w:left="360"/>
+        <w:pStyle w:val="Heading2"/>
       </w:pPr>
       <w:r>
         <w:rPr>
           <w:b/>
-          <w:color w:val="E8431F"/>
-        </w:rPr>
-        <w:t xml:space="preserve">• </w:t>
-      </w:r>
-      <w:r>
-        <w:rPr>
-          <w:rFonts w:ascii="Arial" w:hAnsi="Arial"/>
-          <w:color w:val="334155"/>
-          <w:sz w:val="19"/>
-        </w:rPr>
-        <w:t>1. Dashboard Operasional (`/`) -&gt; File: `Dashboard.jsx`</w:t>
-      </w:r>
-    </w:p>
-    <w:p>
-      <w:pPr>
-        <w:spacing w:after="80" w:line="276" w:lineRule="auto"/>
-        <w:ind w:left="360"/>
-      </w:pPr>
-      <w:r>
-        <w:rPr>
-          <w:b/>
-          <w:color w:val="E8431F"/>
-        </w:rPr>
-        <w:t xml:space="preserve">• </w:t>
-      </w:r>
-      <w:r>
-        <w:rPr>
-          <w:rFonts w:ascii="Arial" w:hAnsi="Arial"/>
-          <w:color w:val="334155"/>
-          <w:sz w:val="19"/>
-        </w:rPr>
-        <w:t>2. Package Tracking &amp; Checker (`/checker`) -&gt; File: `Checker.jsx`</w:t>
-      </w:r>
-    </w:p>
-    <w:p>
-      <w:pPr>
-        <w:spacing w:after="80" w:line="276" w:lineRule="auto"/>
-        <w:ind w:left="360"/>
-      </w:pPr>
-      <w:r>
-        <w:rPr>
-          <w:b/>
-          <w:color w:val="E8431F"/>
-        </w:rPr>
-        <w:t xml:space="preserve">• </w:t>
-      </w:r>
-      <w:r>
-        <w:rPr>
-          <w:rFonts w:ascii="Arial" w:hAnsi="Arial"/>
-          <w:color w:val="334155"/>
-          <w:sz w:val="19"/>
-        </w:rPr>
-        <w:t>3. Master Kantor Pos (`/kantor`) -&gt; File: `MasterKantor.jsx`</w:t>
-      </w:r>
-    </w:p>
-    <w:p>
-      <w:pPr>
-        <w:spacing w:after="80" w:line="276" w:lineRule="auto"/>
-        <w:ind w:left="360"/>
-      </w:pPr>
-      <w:r>
-        <w:rPr>
-          <w:b/>
-          <w:color w:val="E8431F"/>
-        </w:rPr>
-        <w:t xml:space="preserve">• </w:t>
-      </w:r>
-      <w:r>
-        <w:rPr>
-          <w:rFonts w:ascii="Arial" w:hAnsi="Arial"/>
-          <w:color w:val="334155"/>
-          <w:sz w:val="19"/>
-        </w:rPr>
-        <w:t>4. Master Produk &amp; Layanan (`/produk`) -&gt; File: `MasterProduk.jsx`</w:t>
-      </w:r>
-    </w:p>
-    <w:p>
-      <w:pPr>
-        <w:spacing w:after="80" w:line="276" w:lineRule="auto"/>
-        <w:ind w:left="360"/>
-      </w:pPr>
-      <w:r>
-        <w:rPr>
-          <w:b/>
-          <w:color w:val="E8431F"/>
-        </w:rPr>
-        <w:t xml:space="preserve">• </w:t>
-      </w:r>
-      <w:r>
-        <w:rPr>
-          <w:rFonts w:ascii="Arial" w:hAnsi="Arial"/>
-          <w:color w:val="334155"/>
-          <w:sz w:val="19"/>
-        </w:rPr>
-        <w:t>5. Master Kendaraan Armada (`/kendaraan`) -&gt; File: `MasterKendaraan.jsx`</w:t>
-      </w:r>
-    </w:p>
-    <w:p>
-      <w:pPr>
-        <w:spacing w:after="80" w:line="276" w:lineRule="auto"/>
-        <w:ind w:left="360"/>
-      </w:pPr>
-      <w:r>
-        <w:rPr>
-          <w:b/>
-          <w:color w:val="E8431F"/>
-        </w:rPr>
-        <w:t xml:space="preserve">• </w:t>
-      </w:r>
-      <w:r>
-        <w:rPr>
-          <w:rFonts w:ascii="Arial" w:hAnsi="Arial"/>
-          <w:color w:val="334155"/>
-          <w:sz w:val="19"/>
-        </w:rPr>
-        <w:t>6. Master Route Logistik (`/route`) -&gt; File: `MasterRoute.jsx`</w:t>
-      </w:r>
-    </w:p>
-    <w:p>
-      <w:pPr>
-        <w:spacing w:after="80" w:line="276" w:lineRule="auto"/>
-        <w:ind w:left="360"/>
-      </w:pPr>
-      <w:r>
-        <w:rPr>
-          <w:b/>
-          <w:color w:val="E8431F"/>
-        </w:rPr>
-        <w:t xml:space="preserve">• </w:t>
-      </w:r>
-      <w:r>
-        <w:rPr>
-          <w:rFonts w:ascii="Arial" w:hAnsi="Arial"/>
-          <w:color w:val="334155"/>
-          <w:sz w:val="19"/>
-        </w:rPr>
-        <w:t>7. Template Jadwal Transportasi (`/template`) -&gt; File: `TemplateJadwal.jsx`</w:t>
-      </w:r>
-    </w:p>
-    <w:p>
-      <w:pPr>
-        <w:spacing w:after="80" w:line="276" w:lineRule="auto"/>
-        <w:ind w:left="360"/>
-      </w:pPr>
-      <w:r>
-        <w:rPr>
-          <w:b/>
-          <w:color w:val="E8431F"/>
-        </w:rPr>
-        <w:t xml:space="preserve">• </w:t>
-      </w:r>
-      <w:r>
-        <w:rPr>
-          <w:rFonts w:ascii="Arial" w:hAnsi="Arial"/>
-          <w:color w:val="334155"/>
-          <w:sz w:val="19"/>
-        </w:rPr>
-        <w:t>8. Transport Schedule Harian (`/jadwal`) -&gt; File: `JadwalTransportasi.jsx`</w:t>
-      </w:r>
-    </w:p>
-    <w:p>
-      <w:pPr>
-        <w:spacing w:after="80" w:line="276" w:lineRule="auto"/>
-        <w:ind w:left="360"/>
-      </w:pPr>
-      <w:r>
-        <w:rPr>
-          <w:b/>
-          <w:color w:val="E8431F"/>
-        </w:rPr>
-        <w:t xml:space="preserve">• </w:t>
-      </w:r>
-      <w:r>
-        <w:rPr>
-          <w:rFonts w:ascii="Arial" w:hAnsi="Arial"/>
-          <w:color w:val="334155"/>
-          <w:sz w:val="19"/>
-        </w:rPr>
-        <w:t>9. Milk Run Telemetry &amp; Execution (`/route-journey`) -&gt; File: `RouteJourney.jsx`</w:t>
-      </w:r>
-    </w:p>
-    <w:p>
-      <w:pPr>
-        <w:spacing w:after="80" w:line="276" w:lineRule="auto"/>
-        <w:ind w:left="360"/>
-      </w:pPr>
-      <w:r>
-        <w:rPr>
-          <w:b/>
-          <w:color w:val="E8431F"/>
-        </w:rPr>
-        <w:t xml:space="preserve">• </w:t>
-      </w:r>
-      <w:r>
-        <w:rPr>
-          <w:rFonts w:ascii="Arial" w:hAnsi="Arial"/>
-          <w:color w:val="334155"/>
-          <w:sz w:val="19"/>
-        </w:rPr>
-        <w:t>10. Estimasi Milk Run (`/estimasi`) -&gt; File: `EstimasiMilkRun.jsx`</w:t>
-      </w:r>
-    </w:p>
-    <w:p>
-      <w:pPr>
-        <w:spacing w:after="80" w:line="276" w:lineRule="auto"/>
-        <w:ind w:left="360"/>
-      </w:pPr>
-      <w:r>
-        <w:rPr>
-          <w:b/>
-          <w:color w:val="E8431F"/>
-        </w:rPr>
-        <w:t xml:space="preserve">• </w:t>
-      </w:r>
-      <w:r>
-        <w:rPr>
-          <w:rFonts w:ascii="Arial" w:hAnsi="Arial"/>
-          <w:color w:val="334155"/>
-          <w:sz w:val="19"/>
-        </w:rPr>
-        <w:t>11. Gate Monitoring &amp; Transit Hub (`/transit-monitoring`) -&gt; File: `GateMonitoring.jsx`</w:t>
-      </w:r>
-    </w:p>
-    <w:p>
-      <w:pPr>
-        <w:spacing w:after="80" w:line="276" w:lineRule="auto"/>
-        <w:ind w:left="360"/>
-      </w:pPr>
-      <w:r>
-        <w:rPr>
-          <w:b/>
-          <w:color w:val="E8431F"/>
-        </w:rPr>
-        <w:t xml:space="preserve">• </w:t>
-      </w:r>
-      <w:r>
-        <w:rPr>
-          <w:rFonts w:ascii="Arial" w:hAnsi="Arial"/>
-          <w:color w:val="334155"/>
-          <w:sz w:val="19"/>
-        </w:rPr>
-        <w:t>12. Analitik &amp; Laporan Operasional (`/analytics`) -&gt; File: `AnalyticsReport.jsx`</w:t>
-      </w:r>
-    </w:p>
-    <w:p>
-      <w:pPr>
-        <w:spacing w:after="80" w:line="276" w:lineRule="auto"/>
-        <w:ind w:left="360"/>
-      </w:pPr>
-      <w:r>
-        <w:rPr>
-          <w:b/>
-          <w:color w:val="E8431F"/>
-        </w:rPr>
-        <w:t xml:space="preserve">• </w:t>
-      </w:r>
-      <w:r>
-        <w:rPr>
-          <w:rFonts w:ascii="Arial" w:hAnsi="Arial"/>
-          <w:color w:val="334155"/>
-          <w:sz w:val="19"/>
-        </w:rPr>
-        <w:t>13. Database Viewer Transaksi (`/transaksi`) -&gt; File: `Transaksi.jsx`</w:t>
-      </w:r>
-    </w:p>
-    <w:p>
-      <w:pPr>
-        <w:spacing w:after="80" w:line="276" w:lineRule="auto"/>
-        <w:ind w:left="360"/>
-      </w:pPr>
-      <w:r>
-        <w:rPr>
-          <w:b/>
-          <w:color w:val="E8431F"/>
-        </w:rPr>
-        <w:t xml:space="preserve">• </w:t>
-      </w:r>
-      <w:r>
-        <w:rPr>
-          <w:rFonts w:ascii="Arial" w:hAnsi="Arial"/>
-          <w:color w:val="334155"/>
-          <w:sz w:val="19"/>
-        </w:rPr>
-        <w:t>14. System Settings &amp; Compass Connection (`/settings`) -&gt; File: `SettingsPage.jsx`</w:t>
-      </w:r>
-    </w:p>
-    <w:p>
-      <w:pPr>
-        <w:spacing w:after="80" w:line="276" w:lineRule="auto"/>
-        <w:ind w:left="360"/>
-      </w:pPr>
-      <w:r>
-        <w:rPr>
-          <w:b/>
-          <w:color w:val="E8431F"/>
-        </w:rPr>
-        <w:t xml:space="preserve">• </w:t>
-      </w:r>
-      <w:r>
-        <w:rPr>
-          <w:rFonts w:ascii="Arial" w:hAnsi="Arial"/>
-          <w:color w:val="334155"/>
-          <w:sz w:val="19"/>
-        </w:rPr>
-        <w:t>15. Profile User &amp; Account (`/profile`) -&gt; File: `Profile.jsx`</w:t>
-      </w:r>
-    </w:p>
-    <w:p>
-      <w:pPr>
-        <w:spacing w:before="280" w:after="120"/>
-      </w:pPr>
-      <w:r>
-        <w:rPr>
-          <w:rFonts w:ascii="Arial" w:hAnsi="Arial"/>
-          <w:b/>
-          <w:color w:val="0284C7"/>
-          <w:sz w:val="26"/>
+          <w:color w:val="003366"/>
+          <w:sz w:val="23"/>
         </w:rPr>
         <w:t>3. Standar Arsitektur Integrasi Backend &amp; Database</w:t>
       </w:r>
     </w:p>
     <w:p>
-      <w:pPr>
-        <w:spacing w:after="80" w:line="276" w:lineRule="auto"/>
-      </w:pPr>
       <w:r>
         <w:rPr>
-          <w:rFonts w:ascii="Arial" w:hAnsi="Arial"/>
-          <w:color w:val="334155"/>
           <w:sz w:val="19"/>
         </w:rPr>
-        <w:t>Setiap modul terkoneksi dengan Backend Node.js Express.js bertipe OOP Controller (`TransactionController`, `KendaraanController`, `RouteJourneyController`, `KantorController`, dll.) dan menyimpan/mengambil data dari MongoDB koleksi resmi (`transaksi`, `route_journeys`, `master_kendaraan`, `master_kantor`, `detail_route`, `master_route_nopen`, `jadwal_transportasi`).</w:t>
+        <w:t>Seluruh modul halaman terhubung dengan Backend Node.js Express.js berarsitektur OOP MVC. Operasi pembacaan dan pembaruan data dialirkan secara aman melalui API endpoints dengan proteksi validasi, pembatasan hak akses role (RBAC), serta transaksi atomik MongoDB (ACID transaction) pada proses bongkar muat kargo.</w:t>
       </w:r>
     </w:p>
     <w:sectPr>
       <w:pgSz w:w="12240" w:h="15840"/>
-      <w:pgMar w:top="1152" w:right="1296" w:bottom="1152" w:left="1296" w:header="720" w:footer="720" w:gutter="0"/>
+      <w:pgMar w:top="1152" w:right="1152" w:bottom="1152" w:left="1152" w:header="720" w:footer="720" w:gutter="0"/>
       <w:cols w:space="720"/>
       <w:docGrid w:linePitch="360"/>
     </w:sectPr>
@@ -1066,6 +2518,11 @@
     <w:name w:val="Normal"/>
     <w:qFormat/>
     <w:rsid w:val="00FC693F"/>
+    <w:rPr>
+      <w:rFonts w:ascii="Calibri" w:hAnsi="Calibri"/>
+      <w:color w:val="222222"/>
+      <w:sz w:val="20"/>
+    </w:rPr>
   </w:style>
   <w:style w:type="paragraph" w:styleId="Header">
     <w:name w:val="header"/>

</xml_diff>